<commit_message>
added todo list on docx file
</commit_message>
<xml_diff>
--- a/Interim_project_paper.docx
+++ b/Interim_project_paper.docx
@@ -10692,7 +10692,7 @@
           </mc:Choice>
           <mc:Fallback>
             <w:pict>
-              <v:shapetype w14:anchorId="462EDD11" id="_x0000_t34" coordsize="21600,21600" o:spt="34" o:oned="t" adj="10800" path="m,l@0,0@0,21600,21600,21600e" filled="f">
+              <v:shapetype w14:anchorId="33F25495" id="_x0000_t34" coordsize="21600,21600" o:spt="34" o:oned="t" adj="10800" path="m,l@0,0@0,21600,21600,21600e" filled="f">
                 <v:stroke joinstyle="miter"/>
                 <v:formulas>
                   <v:f eqn="val #0"/>
@@ -10789,7 +10789,7 @@
           </mc:Choice>
           <mc:Fallback>
             <w:pict>
-              <v:shapetype w14:anchorId="13029764" id="_x0000_t32" coordsize="21600,21600" o:spt="32" o:oned="t" path="m,l21600,21600e" filled="f">
+              <v:shapetype w14:anchorId="06ABA2D3" id="_x0000_t32" coordsize="21600,21600" o:spt="32" o:oned="t" path="m,l21600,21600e" filled="f">
                 <v:path arrowok="t" fillok="f" o:connecttype="none"/>
                 <o:lock v:ext="edit" shapetype="t"/>
               </v:shapetype>
@@ -10868,7 +10868,7 @@
           </mc:Choice>
           <mc:Fallback>
             <w:pict>
-              <v:shape w14:anchorId="095ECFE8" id="Elbow Connector 5" o:spid="_x0000_s1026" type="#_x0000_t34" style="position:absolute;margin-left:164.85pt;margin-top:56.15pt;width:83.55pt;height:25.35pt;z-index:251715584;visibility:visible;mso-wrap-style:square;mso-width-percent:0;mso-height-percent:0;mso-wrap-distance-left:9pt;mso-wrap-distance-top:0;mso-wrap-distance-right:9pt;mso-wrap-distance-bottom:0;mso-position-horizontal:absolute;mso-position-horizontal-relative:text;mso-position-vertical:absolute;mso-position-vertical-relative:text;mso-width-percent:0;mso-height-percent:0;mso-width-relative:margin;mso-height-relative:margin" o:gfxdata="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" adj="11301" strokecolor="#4472c4 [3204]" strokeweight=".5pt">
+              <v:shape w14:anchorId="768DF3F7" id="Elbow Connector 5" o:spid="_x0000_s1026" type="#_x0000_t34" style="position:absolute;margin-left:164.85pt;margin-top:56.15pt;width:83.55pt;height:25.35pt;z-index:251715584;visibility:visible;mso-wrap-style:square;mso-width-percent:0;mso-height-percent:0;mso-wrap-distance-left:9pt;mso-wrap-distance-top:0;mso-wrap-distance-right:9pt;mso-wrap-distance-bottom:0;mso-position-horizontal:absolute;mso-position-horizontal-relative:text;mso-position-vertical:absolute;mso-position-vertical-relative:text;mso-width-percent:0;mso-height-percent:0;mso-width-relative:margin;mso-height-relative:margin" o:gfxdata="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" adj="11301" strokecolor="#4472c4 [3204]" strokeweight=".5pt">
                 <v:stroke endarrow="block"/>
               </v:shape>
             </w:pict>
@@ -12566,6 +12566,111 @@
           <w:lang w:val="en-US"/>
         </w:rPr>
       </w:pPr>
+    </w:p>
+    <w:p>
+      <w:pPr>
+        <w:spacing w:line="276" w:lineRule="auto"/>
+        <w:jc w:val="both"/>
+        <w:rPr>
+          <w:rFonts w:ascii="Times" w:hAnsi="Times"/>
+          <w:lang w:val="en-US"/>
+        </w:rPr>
+      </w:pPr>
+      <w:r>
+        <w:rPr>
+          <w:rFonts w:ascii="Times" w:hAnsi="Times"/>
+          <w:lang w:val="en-US"/>
+        </w:rPr>
+        <w:t>## TODO:</w:t>
+      </w:r>
+    </w:p>
+    <w:p>
+      <w:pPr>
+        <w:pStyle w:val="ListParagraph"/>
+        <w:numPr>
+          <w:ilvl w:val="0"/>
+          <w:numId w:val="5"/>
+        </w:numPr>
+        <w:spacing w:line="276" w:lineRule="auto"/>
+        <w:jc w:val="both"/>
+        <w:rPr>
+          <w:rFonts w:ascii="Times" w:hAnsi="Times"/>
+          <w:lang w:val="en-US"/>
+        </w:rPr>
+      </w:pPr>
+      <w:r>
+        <w:rPr>
+          <w:rFonts w:ascii="Times" w:hAnsi="Times"/>
+          <w:lang w:val="en-US"/>
+        </w:rPr>
+        <w:t>Padam için referans eklenmeli</w:t>
+      </w:r>
+    </w:p>
+    <w:p>
+      <w:pPr>
+        <w:pStyle w:val="ListParagraph"/>
+        <w:numPr>
+          <w:ilvl w:val="0"/>
+          <w:numId w:val="5"/>
+        </w:numPr>
+        <w:spacing w:line="276" w:lineRule="auto"/>
+        <w:jc w:val="both"/>
+        <w:rPr>
+          <w:rFonts w:ascii="Times" w:hAnsi="Times"/>
+          <w:lang w:val="en-US"/>
+        </w:rPr>
+      </w:pPr>
+      <w:r>
+        <w:rPr>
+          <w:rFonts w:ascii="Times" w:hAnsi="Times"/>
+          <w:lang w:val="en-US"/>
+        </w:rPr>
+        <w:t>Optimizerlar için final momentum, partial, betas, weight decay değerleri</w:t>
+      </w:r>
+    </w:p>
+    <w:p>
+      <w:pPr>
+        <w:pStyle w:val="ListParagraph"/>
+        <w:numPr>
+          <w:ilvl w:val="1"/>
+          <w:numId w:val="5"/>
+        </w:numPr>
+        <w:spacing w:line="276" w:lineRule="auto"/>
+        <w:jc w:val="both"/>
+        <w:rPr>
+          <w:rFonts w:ascii="Times" w:hAnsi="Times"/>
+          <w:lang w:val="en-US"/>
+        </w:rPr>
+      </w:pPr>
+      <w:r>
+        <w:rPr>
+          <w:rFonts w:ascii="Times" w:hAnsi="Times"/>
+          <w:lang w:val="en-US"/>
+        </w:rPr>
+        <w:t>Gerekli mi?</w:t>
+      </w:r>
+    </w:p>
+    <w:p>
+      <w:pPr>
+        <w:pStyle w:val="ListParagraph"/>
+        <w:numPr>
+          <w:ilvl w:val="0"/>
+          <w:numId w:val="5"/>
+        </w:numPr>
+        <w:spacing w:line="276" w:lineRule="auto"/>
+        <w:jc w:val="both"/>
+        <w:rPr>
+          <w:rFonts w:ascii="Times" w:hAnsi="Times"/>
+          <w:lang w:val="en-US"/>
+        </w:rPr>
+      </w:pPr>
+      <w:r>
+        <w:rPr>
+          <w:rFonts w:ascii="Times" w:hAnsi="Times"/>
+          <w:lang w:val="en-US"/>
+        </w:rPr>
+        <w:t>ResNet18 %84.35 sonuç alınan pth dosyasının drive/github linki eklenmeli</w:t>
+      </w:r>
     </w:p>
     <w:sectPr>
       <w:pgSz w:w="11900" w:h="16840"/>
@@ -12618,6 +12723,95 @@
 <file path=word/numbering.xml><?xml version="1.0" encoding="utf-8"?>
 <w:numbering xmlns:wpc="http://schemas.microsoft.com/office/word/2010/wordprocessingCanvas" xmlns:cx="http://schemas.microsoft.com/office/drawing/2014/chartex" xmlns:cx1="http://schemas.microsoft.com/office/drawing/2015/9/8/chartex" xmlns:cx2="http://schemas.microsoft.com/office/drawing/2015/10/21/chartex" xmlns:cx3="http://schemas.microsoft.com/office/drawing/2016/5/9/chartex" xmlns:cx4="http://schemas.microsoft.com/office/drawing/2016/5/10/chartex" xmlns:cx5="http://schemas.microsoft.com/office/drawing/2016/5/11/chartex" xmlns:cx6="http://schemas.microsoft.com/office/drawing/2016/5/12/chartex" xmlns:cx7="http://schemas.microsoft.com/office/drawing/2016/5/13/chartex" xmlns:cx8="http://schemas.microsoft.com/office/drawing/2016/5/14/chartex" xmlns:mc="http://schemas.openxmlformats.org/markup-compatibility/2006" xmlns:aink="http://schemas.microsoft.com/office/drawing/2016/ink" xmlns:am3d="http://schemas.microsoft.com/office/drawing/2017/model3d" xmlns:o="urn:schemas-microsoft-com:office:office" xmlns:r="http://schemas.openxmlformats.org/officeDocument/2006/relationships" xmlns:m="http://schemas.openxmlformats.org/officeDocument/2006/math" xmlns:v="urn:schemas-microsoft-com:vml" xmlns:wp14="http://schemas.microsoft.com/office/word/2010/wordprocessingDrawing" xmlns:wp="http://schemas.openxmlformats.org/drawingml/2006/wordprocessingDrawing" xmlns:w10="urn:schemas-microsoft-com:office:word" xmlns:w="http://schemas.openxmlformats.org/wordprocessingml/2006/main" xmlns:w14="http://schemas.microsoft.com/office/word/2010/wordml" xmlns:w15="http://schemas.microsoft.com/office/word/2012/wordml" xmlns:w16cex="http://schemas.microsoft.com/office/word/2018/wordml/cex" xmlns:w16cid="http://schemas.microsoft.com/office/word/2016/wordml/cid" xmlns:w16="http://schemas.microsoft.com/office/word/2018/wordml" xmlns:w16se="http://schemas.microsoft.com/office/word/2015/wordml/symex" xmlns:wpg="http://schemas.microsoft.com/office/word/2010/wordprocessingGroup" xmlns:wpi="http://schemas.microsoft.com/office/word/2010/wordprocessingInk" xmlns:wne="http://schemas.microsoft.com/office/word/2006/wordml" xmlns:wps="http://schemas.microsoft.com/office/word/2010/wordprocessingShape" mc:Ignorable="w14 w15 w16se w16cid w16 w16cex wp14">
   <w:abstractNum w:abstractNumId="0" w15:restartNumberingAfterBreak="0">
+    <w:nsid w:val="01B36DAC"/>
+    <w:multiLevelType w:val="hybridMultilevel"/>
+    <w:tmpl w:val="E9B6A044"/>
+    <w:lvl w:ilvl="0" w:tplc="0409000F">
+      <w:start w:val="1"/>
+      <w:numFmt w:val="decimal"/>
+      <w:lvlText w:val="%1."/>
+      <w:lvlJc w:val="left"/>
+      <w:pPr>
+        <w:ind w:left="720" w:hanging="360"/>
+      </w:pPr>
+      <w:rPr>
+        <w:rFonts w:hint="default"/>
+      </w:rPr>
+    </w:lvl>
+    <w:lvl w:ilvl="1" w:tplc="04090019">
+      <w:start w:val="1"/>
+      <w:numFmt w:val="lowerLetter"/>
+      <w:lvlText w:val="%2."/>
+      <w:lvlJc w:val="left"/>
+      <w:pPr>
+        <w:ind w:left="1440" w:hanging="360"/>
+      </w:pPr>
+    </w:lvl>
+    <w:lvl w:ilvl="2" w:tplc="0409001B" w:tentative="1">
+      <w:start w:val="1"/>
+      <w:numFmt w:val="lowerRoman"/>
+      <w:lvlText w:val="%3."/>
+      <w:lvlJc w:val="right"/>
+      <w:pPr>
+        <w:ind w:left="2160" w:hanging="180"/>
+      </w:pPr>
+    </w:lvl>
+    <w:lvl w:ilvl="3" w:tplc="0409000F" w:tentative="1">
+      <w:start w:val="1"/>
+      <w:numFmt w:val="decimal"/>
+      <w:lvlText w:val="%4."/>
+      <w:lvlJc w:val="left"/>
+      <w:pPr>
+        <w:ind w:left="2880" w:hanging="360"/>
+      </w:pPr>
+    </w:lvl>
+    <w:lvl w:ilvl="4" w:tplc="04090019" w:tentative="1">
+      <w:start w:val="1"/>
+      <w:numFmt w:val="lowerLetter"/>
+      <w:lvlText w:val="%5."/>
+      <w:lvlJc w:val="left"/>
+      <w:pPr>
+        <w:ind w:left="3600" w:hanging="360"/>
+      </w:pPr>
+    </w:lvl>
+    <w:lvl w:ilvl="5" w:tplc="0409001B" w:tentative="1">
+      <w:start w:val="1"/>
+      <w:numFmt w:val="lowerRoman"/>
+      <w:lvlText w:val="%6."/>
+      <w:lvlJc w:val="right"/>
+      <w:pPr>
+        <w:ind w:left="4320" w:hanging="180"/>
+      </w:pPr>
+    </w:lvl>
+    <w:lvl w:ilvl="6" w:tplc="0409000F" w:tentative="1">
+      <w:start w:val="1"/>
+      <w:numFmt w:val="decimal"/>
+      <w:lvlText w:val="%7."/>
+      <w:lvlJc w:val="left"/>
+      <w:pPr>
+        <w:ind w:left="5040" w:hanging="360"/>
+      </w:pPr>
+    </w:lvl>
+    <w:lvl w:ilvl="7" w:tplc="04090019" w:tentative="1">
+      <w:start w:val="1"/>
+      <w:numFmt w:val="lowerLetter"/>
+      <w:lvlText w:val="%8."/>
+      <w:lvlJc w:val="left"/>
+      <w:pPr>
+        <w:ind w:left="5760" w:hanging="360"/>
+      </w:pPr>
+    </w:lvl>
+    <w:lvl w:ilvl="8" w:tplc="0409001B" w:tentative="1">
+      <w:start w:val="1"/>
+      <w:numFmt w:val="lowerRoman"/>
+      <w:lvlText w:val="%9."/>
+      <w:lvlJc w:val="right"/>
+      <w:pPr>
+        <w:ind w:left="6480" w:hanging="180"/>
+      </w:pPr>
+    </w:lvl>
+  </w:abstractNum>
+  <w:abstractNum w:abstractNumId="1" w15:restartNumberingAfterBreak="0">
     <w:nsid w:val="1BEB4AF4"/>
     <w:multiLevelType w:val="hybridMultilevel"/>
     <w:tmpl w:val="B880BF52"/>
@@ -12706,7 +12900,7 @@
       </w:pPr>
     </w:lvl>
   </w:abstractNum>
-  <w:abstractNum w:abstractNumId="1" w15:restartNumberingAfterBreak="0">
+  <w:abstractNum w:abstractNumId="2" w15:restartNumberingAfterBreak="0">
     <w:nsid w:val="414410B1"/>
     <w:multiLevelType w:val="hybridMultilevel"/>
     <w:tmpl w:val="8BFCC674"/>
@@ -12795,7 +12989,7 @@
       </w:pPr>
     </w:lvl>
   </w:abstractNum>
-  <w:abstractNum w:abstractNumId="2" w15:restartNumberingAfterBreak="0">
+  <w:abstractNum w:abstractNumId="3" w15:restartNumberingAfterBreak="0">
     <w:nsid w:val="486E7196"/>
     <w:multiLevelType w:val="hybridMultilevel"/>
     <w:tmpl w:val="2B14EAA6"/>
@@ -12884,7 +13078,7 @@
       </w:pPr>
     </w:lvl>
   </w:abstractNum>
-  <w:abstractNum w:abstractNumId="3" w15:restartNumberingAfterBreak="0">
+  <w:abstractNum w:abstractNumId="4" w15:restartNumberingAfterBreak="0">
     <w:nsid w:val="53164213"/>
     <w:multiLevelType w:val="hybridMultilevel"/>
     <w:tmpl w:val="603A0190"/>
@@ -12974,15 +13168,18 @@
     </w:lvl>
   </w:abstractNum>
   <w:num w:numId="1">
+    <w:abstractNumId w:val="4"/>
+  </w:num>
+  <w:num w:numId="2">
     <w:abstractNumId w:val="3"/>
   </w:num>
-  <w:num w:numId="2">
+  <w:num w:numId="3">
     <w:abstractNumId w:val="2"/>
   </w:num>
-  <w:num w:numId="3">
+  <w:num w:numId="4">
     <w:abstractNumId w:val="1"/>
   </w:num>
-  <w:num w:numId="4">
+  <w:num w:numId="5">
     <w:abstractNumId w:val="0"/>
   </w:num>
 </w:numbering>

</xml_diff>

<commit_message>
added auc calculation and updated docx
</commit_message>
<xml_diff>
--- a/Interim_project_paper.docx
+++ b/Interim_project_paper.docx
@@ -397,15 +397,7 @@
           <w:rStyle w:val="jlqj4b"/>
           <w:lang w:val="en-US"/>
         </w:rPr>
-        <w:t xml:space="preserve">According to the results obtained, it proved that the proposed model can reach 90.39% accuracy and the area under the </w:t>
-      </w:r>
-      <w:r>
-        <w:rPr>
-          <w:rStyle w:val="jlqj4b"/>
-          <w:lang w:val="en-US"/>
-        </w:rPr>
-        <w:lastRenderedPageBreak/>
-        <w:t>receiver operating characteristic curve (AUC) of 0.9738.</w:t>
+        <w:t>According to the results obtained, it proved that the proposed model can reach 90.39% accuracy and the area under the receiver operating characteristic curve (AUC) of 0.9738.</w:t>
       </w:r>
       <w:r>
         <w:rPr>
@@ -778,6 +770,36 @@
         </w:rPr>
         <w:t>For clarity, the studies described above and more are summarized in the table below.</w:t>
       </w:r>
+    </w:p>
+    <w:p>
+      <w:pPr>
+        <w:spacing w:line="276" w:lineRule="auto"/>
+        <w:jc w:val="both"/>
+        <w:rPr>
+          <w:rStyle w:val="jlqj4b"/>
+          <w:lang w:val="en-US"/>
+        </w:rPr>
+      </w:pPr>
+    </w:p>
+    <w:p>
+      <w:pPr>
+        <w:spacing w:line="276" w:lineRule="auto"/>
+        <w:jc w:val="both"/>
+        <w:rPr>
+          <w:rStyle w:val="jlqj4b"/>
+          <w:lang w:val="en-US"/>
+        </w:rPr>
+      </w:pPr>
+    </w:p>
+    <w:p>
+      <w:pPr>
+        <w:spacing w:line="276" w:lineRule="auto"/>
+        <w:jc w:val="both"/>
+        <w:rPr>
+          <w:rStyle w:val="jlqj4b"/>
+          <w:lang w:val="en-US"/>
+        </w:rPr>
+      </w:pPr>
     </w:p>
     <w:p>
       <w:pPr>
@@ -1138,7 +1160,25 @@
                 <w:bCs w:val="0"/>
                 <w:lang w:val="en-US"/>
               </w:rPr>
-              <w:t>Kong et al.[6]</w:t>
+              <w:t>Kong et al.</w:t>
+            </w:r>
+            <w:r>
+              <w:rPr>
+                <w:rFonts w:ascii="Times" w:hAnsi="Times"/>
+                <w:b w:val="0"/>
+                <w:bCs w:val="0"/>
+                <w:lang w:val="en-US"/>
+              </w:rPr>
+              <w:t xml:space="preserve"> </w:t>
+            </w:r>
+            <w:r>
+              <w:rPr>
+                <w:rFonts w:ascii="Times" w:hAnsi="Times"/>
+                <w:b w:val="0"/>
+                <w:bCs w:val="0"/>
+                <w:lang w:val="en-US"/>
+              </w:rPr>
+              <w:t>[6]</w:t>
             </w:r>
           </w:p>
         </w:tc>
@@ -1282,7 +1322,25 @@
                 <w:bCs w:val="0"/>
                 <w:lang w:val="en-US"/>
               </w:rPr>
-              <w:t>Saeed et al.[</w:t>
+              <w:t>Saeed et al.</w:t>
+            </w:r>
+            <w:r>
+              <w:rPr>
+                <w:rFonts w:ascii="Times" w:hAnsi="Times"/>
+                <w:b w:val="0"/>
+                <w:bCs w:val="0"/>
+                <w:lang w:val="en-US"/>
+              </w:rPr>
+              <w:t xml:space="preserve"> </w:t>
+            </w:r>
+            <w:r>
+              <w:rPr>
+                <w:rFonts w:ascii="Times" w:hAnsi="Times"/>
+                <w:b w:val="0"/>
+                <w:bCs w:val="0"/>
+                <w:lang w:val="en-US"/>
+              </w:rPr>
+              <w:t>[</w:t>
             </w:r>
             <w:r>
               <w:rPr>
@@ -1903,6 +1961,15 @@
                 <w:bCs w:val="0"/>
                 <w:lang w:val="en-US"/>
               </w:rPr>
+              <w:t xml:space="preserve"> </w:t>
+            </w:r>
+            <w:r>
+              <w:rPr>
+                <w:rFonts w:ascii="Times" w:hAnsi="Times"/>
+                <w:b w:val="0"/>
+                <w:bCs w:val="0"/>
+                <w:lang w:val="en-US"/>
+              </w:rPr>
               <w:t>[15]</w:t>
             </w:r>
           </w:p>
@@ -3104,7 +3171,49 @@
           <w:rStyle w:val="jlqj4b"/>
           <w:lang w:val="en-US"/>
         </w:rPr>
-        <w:t>we have proposed classification of ASD using a deep convolution neural network based pre-trained models and brain MRI.</w:t>
+        <w:t xml:space="preserve">we have proposed classification of ASD </w:t>
+      </w:r>
+      <w:r>
+        <w:rPr>
+          <w:rStyle w:val="jlqj4b"/>
+          <w:lang w:val="en-US"/>
+        </w:rPr>
+        <w:t xml:space="preserve">by Machine Learning algorithms </w:t>
+      </w:r>
+      <w:r>
+        <w:rPr>
+          <w:rStyle w:val="jlqj4b"/>
+          <w:lang w:val="en-US"/>
+        </w:rPr>
+        <w:t xml:space="preserve">using deep </w:t>
+      </w:r>
+      <w:r>
+        <w:rPr>
+          <w:rStyle w:val="jlqj4b"/>
+          <w:lang w:val="en-US"/>
+        </w:rPr>
+        <w:t xml:space="preserve">features obtained from deep </w:t>
+      </w:r>
+      <w:r>
+        <w:rPr>
+          <w:rStyle w:val="jlqj4b"/>
+          <w:lang w:val="en-US"/>
+        </w:rPr>
+        <w:t xml:space="preserve">convolution neural network based </w:t>
+      </w:r>
+      <w:r>
+        <w:rPr>
+          <w:rStyle w:val="jlqj4b"/>
+          <w:lang w:val="en-US"/>
+        </w:rPr>
+        <w:t xml:space="preserve">on </w:t>
+      </w:r>
+      <w:r>
+        <w:rPr>
+          <w:rStyle w:val="jlqj4b"/>
+          <w:lang w:val="en-US"/>
+        </w:rPr>
+        <w:t>pre-trained models and brain MRI.</w:t>
       </w:r>
       <w:r>
         <w:rPr>
@@ -3160,10 +3269,53 @@
           <w:rStyle w:val="jlqj4b"/>
           <w:lang w:val="en-US"/>
         </w:rPr>
-        <w:t>For each pre-trained model, Adam, Padam and SGD optimizer are run separately.</w:t>
-      </w:r>
-      <w:r>
-        <w:rPr>
+        <w:t>For each pre-trained</w:t>
+      </w:r>
+      <w:r>
+        <w:rPr>
+          <w:rStyle w:val="jlqj4b"/>
+          <w:lang w:val="en-US"/>
+        </w:rPr>
+        <w:t xml:space="preserve"> CNN</w:t>
+      </w:r>
+      <w:r>
+        <w:rPr>
+          <w:rStyle w:val="jlqj4b"/>
+          <w:lang w:val="en-US"/>
+        </w:rPr>
+        <w:t xml:space="preserve"> model,</w:t>
+      </w:r>
+      <w:r>
+        <w:rPr>
+          <w:rStyle w:val="jlqj4b"/>
+          <w:lang w:val="en-US"/>
+        </w:rPr>
+        <w:t xml:space="preserve"> t</w:t>
+      </w:r>
+      <w:r>
+        <w:rPr>
+          <w:rFonts w:ascii="Times" w:hAnsi="Times"/>
+          <w:lang w:val="en-US"/>
+        </w:rPr>
+        <w:t>wo novel, SGD+Momentum &amp; Adam</w:t>
+      </w:r>
+      <w:r>
+        <w:rPr>
+          <w:rFonts w:ascii="Times" w:hAnsi="Times"/>
+          <w:lang w:val="en-US"/>
+        </w:rPr>
+        <w:t xml:space="preserve">, </w:t>
+      </w:r>
+      <w:r>
+        <w:rPr>
+          <w:rFonts w:ascii="Times" w:hAnsi="Times"/>
+          <w:lang w:val="en-US"/>
+        </w:rPr>
+        <w:t>and one recent, Padam</w:t>
+      </w:r>
+      <w:r>
+        <w:rPr>
+          <w:rFonts w:ascii="Times" w:hAnsi="Times"/>
           <w:lang w:val="en-US"/>
         </w:rPr>
         <w:t xml:space="preserve"> </w:t>
@@ -3173,7 +3325,111 @@
           <w:rStyle w:val="jlqj4b"/>
           <w:lang w:val="en-US"/>
         </w:rPr>
-        <w:t>The model that gives the best result among the pre-train models has been combined with the ML model to feature extraction.</w:t>
+        <w:t>[20]</w:t>
+      </w:r>
+      <w:r>
+        <w:rPr>
+          <w:rFonts w:ascii="Times" w:hAnsi="Times"/>
+          <w:lang w:val="en-US"/>
+        </w:rPr>
+        <w:t>, optimizers</w:t>
+      </w:r>
+      <w:r>
+        <w:rPr>
+          <w:rStyle w:val="jlqj4b"/>
+          <w:lang w:val="en-US"/>
+        </w:rPr>
+        <w:t xml:space="preserve"> were</w:t>
+      </w:r>
+      <w:r>
+        <w:rPr>
+          <w:rStyle w:val="jlqj4b"/>
+          <w:lang w:val="en-US"/>
+        </w:rPr>
+        <w:t xml:space="preserve"> run separately</w:t>
+      </w:r>
+      <w:r>
+        <w:rPr>
+          <w:rStyle w:val="jlqj4b"/>
+          <w:lang w:val="en-US"/>
+        </w:rPr>
+        <w:t xml:space="preserve"> on Cross-Entropy Loss</w:t>
+      </w:r>
+      <w:r>
+        <w:rPr>
+          <w:rStyle w:val="jlqj4b"/>
+          <w:lang w:val="en-US"/>
+        </w:rPr>
+        <w:t>.</w:t>
+      </w:r>
+      <w:r>
+        <w:rPr>
+          <w:lang w:val="en-US"/>
+        </w:rPr>
+        <w:t xml:space="preserve"> </w:t>
+      </w:r>
+      <w:r>
+        <w:rPr>
+          <w:rStyle w:val="jlqj4b"/>
+          <w:lang w:val="en-US"/>
+        </w:rPr>
+        <w:t xml:space="preserve">The model that gives the best result among the pre-train models has been </w:t>
+      </w:r>
+      <w:r>
+        <w:rPr>
+          <w:rStyle w:val="jlqj4b"/>
+          <w:lang w:val="en-US"/>
+        </w:rPr>
+        <w:t>used to extract deep features of dataset, then the features were inserted</w:t>
+      </w:r>
+      <w:r>
+        <w:rPr>
+          <w:rStyle w:val="jlqj4b"/>
+          <w:lang w:val="en-US"/>
+        </w:rPr>
+        <w:t xml:space="preserve"> </w:t>
+      </w:r>
+      <w:r>
+        <w:rPr>
+          <w:rStyle w:val="jlqj4b"/>
+          <w:lang w:val="en-US"/>
+        </w:rPr>
+        <w:t>into</w:t>
+      </w:r>
+      <w:r>
+        <w:rPr>
+          <w:rStyle w:val="jlqj4b"/>
+          <w:lang w:val="en-US"/>
+        </w:rPr>
+        <w:t xml:space="preserve"> ML </w:t>
+      </w:r>
+      <w:r>
+        <w:rPr>
+          <w:rStyle w:val="jlqj4b"/>
+          <w:lang w:val="en-US"/>
+        </w:rPr>
+        <w:t>algorithms</w:t>
+      </w:r>
+      <w:r>
+        <w:rPr>
+          <w:rStyle w:val="jlqj4b"/>
+          <w:lang w:val="en-US"/>
+        </w:rPr>
+        <w:t xml:space="preserve"> to </w:t>
+      </w:r>
+      <w:r>
+        <w:rPr>
+          <w:rStyle w:val="jlqj4b"/>
+          <w:lang w:val="en-US"/>
+        </w:rPr>
+        <w:t>final classification</w:t>
+      </w:r>
+      <w:r>
+        <w:rPr>
+          <w:rStyle w:val="jlqj4b"/>
+          <w:lang w:val="en-US"/>
+        </w:rPr>
+        <w:t>.</w:t>
       </w:r>
       <w:r>
         <w:rPr>
@@ -3644,7 +3900,55 @@
         <w:rPr>
           <w:lang w:val="en-US"/>
         </w:rPr>
-        <w:t>ur dataset contains 896 individuals with ASD and 286 normal subjects. Gender was not considered as a feature for the classifier.</w:t>
+        <w:t xml:space="preserve">ur dataset </w:t>
+      </w:r>
+      <w:r>
+        <w:rPr>
+          <w:lang w:val="en-US"/>
+        </w:rPr>
+        <w:t xml:space="preserve">consists of 1190 samples which </w:t>
+      </w:r>
+      <w:r>
+        <w:rPr>
+          <w:lang w:val="en-US"/>
+        </w:rPr>
+        <w:t xml:space="preserve">contain </w:t>
+      </w:r>
+      <w:r>
+        <w:rPr>
+          <w:lang w:val="en-US"/>
+        </w:rPr>
+        <w:t>583</w:t>
+      </w:r>
+      <w:r>
+        <w:rPr>
+          <w:lang w:val="en-US"/>
+        </w:rPr>
+        <w:t xml:space="preserve"> individuals with ASD and </w:t>
+      </w:r>
+      <w:r>
+        <w:rPr>
+          <w:lang w:val="en-US"/>
+        </w:rPr>
+        <w:t>607</w:t>
+      </w:r>
+      <w:r>
+        <w:rPr>
+          <w:lang w:val="en-US"/>
+        </w:rPr>
+        <w:t xml:space="preserve"> normal subjects. Gender </w:t>
+      </w:r>
+      <w:r>
+        <w:rPr>
+          <w:lang w:val="en-US"/>
+        </w:rPr>
+        <w:t>and age were</w:t>
+      </w:r>
+      <w:r>
+        <w:rPr>
+          <w:lang w:val="en-US"/>
+        </w:rPr>
+        <w:t xml:space="preserve"> not considered as a feature for the classifier.</w:t>
       </w:r>
       <w:r>
         <w:rPr>
@@ -4139,13 +4443,76 @@
           <w:rStyle w:val="jlqj4b"/>
           <w:lang w:val="en-US"/>
         </w:rPr>
-        <w:t xml:space="preserve">In this study, we have proposed classification of ASD using a deep convolution neural network based pre-trained models and brain MRI. The ResNet18, AlexNet, </w:t>
+        <w:t>In this study, we have proposed</w:t>
       </w:r>
       <w:r>
         <w:rPr>
           <w:rStyle w:val="jlqj4b"/>
           <w:lang w:val="en-US"/>
         </w:rPr>
+        <w:t xml:space="preserve"> the</w:t>
+      </w:r>
+      <w:r>
+        <w:rPr>
+          <w:rStyle w:val="jlqj4b"/>
+          <w:lang w:val="en-US"/>
+        </w:rPr>
+        <w:t xml:space="preserve"> classification of ASD </w:t>
+      </w:r>
+      <w:r>
+        <w:rPr>
+          <w:rStyle w:val="jlqj4b"/>
+          <w:lang w:val="en-US"/>
+        </w:rPr>
+        <w:t>based on</w:t>
+      </w:r>
+      <w:r>
+        <w:rPr>
+          <w:rStyle w:val="jlqj4b"/>
+          <w:lang w:val="en-US"/>
+        </w:rPr>
+        <w:t xml:space="preserve"> </w:t>
+      </w:r>
+      <w:r>
+        <w:rPr>
+          <w:rStyle w:val="jlqj4b"/>
+          <w:lang w:val="en-US"/>
+        </w:rPr>
+        <w:t>the</w:t>
+      </w:r>
+      <w:r>
+        <w:rPr>
+          <w:rStyle w:val="jlqj4b"/>
+          <w:lang w:val="en-US"/>
+        </w:rPr>
+        <w:t xml:space="preserve"> deep features extracting from</w:t>
+      </w:r>
+      <w:r>
+        <w:rPr>
+          <w:rStyle w:val="jlqj4b"/>
+          <w:lang w:val="en-US"/>
+        </w:rPr>
+        <w:t xml:space="preserve"> convolution neural </w:t>
+      </w:r>
+      <w:r>
+        <w:rPr>
+          <w:rStyle w:val="jlqj4b"/>
+          <w:lang w:val="en-US"/>
+        </w:rPr>
+        <w:t xml:space="preserve">networks </w:t>
+      </w:r>
+      <w:r>
+        <w:rPr>
+          <w:rStyle w:val="jlqj4b"/>
+          <w:lang w:val="en-US"/>
+        </w:rPr>
+        <w:t xml:space="preserve">and brain MRI. The ResNet18, AlexNet, </w:t>
+      </w:r>
+      <w:r>
+        <w:rPr>
+          <w:rStyle w:val="jlqj4b"/>
+          <w:lang w:val="en-US"/>
+        </w:rPr>
         <w:t>VGG</w:t>
       </w:r>
       <w:r>
@@ -4188,22 +4555,22 @@
           <w:rStyle w:val="jlqj4b"/>
           <w:lang w:val="en-US"/>
         </w:rPr>
-        <w:t xml:space="preserve">and </w:t>
+        <w:t xml:space="preserve">and DenseNet169 </w:t>
       </w:r>
       <w:r>
         <w:rPr>
           <w:rStyle w:val="jlqj4b"/>
           <w:lang w:val="en-US"/>
         </w:rPr>
+        <w:t xml:space="preserve">pre-trained models output becomes the input of the specified network </w:t>
+      </w:r>
+      <w:r>
+        <w:rPr>
+          <w:rStyle w:val="jlqj4b"/>
+          <w:lang w:val="en-US"/>
+        </w:rPr>
         <w:lastRenderedPageBreak/>
-        <w:t xml:space="preserve">DenseNet169 </w:t>
-      </w:r>
-      <w:r>
-        <w:rPr>
-          <w:rStyle w:val="jlqj4b"/>
-          <w:lang w:val="en-US"/>
-        </w:rPr>
-        <w:t>pre-trained models output becomes the input of the specified network topology.</w:t>
+        <w:t>topology.</w:t>
       </w:r>
       <w:r>
         <w:rPr>
@@ -4466,7 +4833,6 @@
         <w:spacing w:line="276" w:lineRule="auto"/>
         <w:jc w:val="center"/>
         <w:rPr>
-          <w:rStyle w:val="jlqj4b"/>
           <w:lang w:val="en-US"/>
         </w:rPr>
       </w:pPr>
@@ -4490,6 +4856,16 @@
         </w:rPr>
         <w:t>Resnet18 model</w:t>
       </w:r>
+    </w:p>
+    <w:p>
+      <w:pPr>
+        <w:spacing w:line="276" w:lineRule="auto"/>
+        <w:jc w:val="center"/>
+        <w:rPr>
+          <w:rStyle w:val="jlqj4b"/>
+          <w:lang w:val="en-US"/>
+        </w:rPr>
+      </w:pPr>
     </w:p>
     <w:p>
       <w:pPr>
@@ -4518,7 +4894,63 @@
           <w:rStyle w:val="jlqj4b"/>
           <w:lang w:val="en-US"/>
         </w:rPr>
-        <w:t>ccuracy rate by extracting features, Resnet18, which is the best result among pre-trained models, and ML algorithms are combined.</w:t>
+        <w:t xml:space="preserve">ccuracy rate </w:t>
+      </w:r>
+      <w:r>
+        <w:rPr>
+          <w:rStyle w:val="jlqj4b"/>
+          <w:lang w:val="en-US"/>
+        </w:rPr>
+        <w:t xml:space="preserve">on classification task, </w:t>
+      </w:r>
+      <w:r>
+        <w:rPr>
+          <w:rStyle w:val="jlqj4b"/>
+          <w:lang w:val="en-US"/>
+        </w:rPr>
+        <w:t>extract</w:t>
+      </w:r>
+      <w:r>
+        <w:rPr>
+          <w:rStyle w:val="jlqj4b"/>
+          <w:lang w:val="en-US"/>
+        </w:rPr>
+        <w:t>ed deep</w:t>
+      </w:r>
+      <w:r>
+        <w:rPr>
+          <w:rStyle w:val="jlqj4b"/>
+          <w:lang w:val="en-US"/>
+        </w:rPr>
+        <w:t xml:space="preserve"> features</w:t>
+      </w:r>
+      <w:r>
+        <w:rPr>
+          <w:rStyle w:val="jlqj4b"/>
+          <w:lang w:val="en-US"/>
+        </w:rPr>
+        <w:t xml:space="preserve"> over </w:t>
+      </w:r>
+      <w:r>
+        <w:rPr>
+          <w:rStyle w:val="jlqj4b"/>
+          <w:lang w:val="en-US"/>
+        </w:rPr>
+        <w:t>Res</w:t>
+      </w:r>
+      <w:r>
+        <w:rPr>
+          <w:rStyle w:val="jlqj4b"/>
+          <w:lang w:val="en-US"/>
+        </w:rPr>
+        <w:t>N</w:t>
+      </w:r>
+      <w:r>
+        <w:rPr>
+          <w:rStyle w:val="jlqj4b"/>
+          <w:lang w:val="en-US"/>
+        </w:rPr>
+        <w:t>et18, which is the best result among pre-trained models, and ML algorithms are combined.</w:t>
       </w:r>
       <w:r>
         <w:rPr>
@@ -4629,7 +5061,31 @@
         <w:rPr>
           <w:lang w:val="en-US"/>
         </w:rPr>
-        <w:t>Block diagram of the CNN+ML model</w:t>
+        <w:t xml:space="preserve">Block diagram of the </w:t>
+      </w:r>
+      <w:r>
+        <w:rPr>
+          <w:lang w:val="en-US"/>
+        </w:rPr>
+        <w:t xml:space="preserve">combined method of </w:t>
+      </w:r>
+      <w:r>
+        <w:rPr>
+          <w:lang w:val="en-US"/>
+        </w:rPr>
+        <w:t>CNN</w:t>
+      </w:r>
+      <w:r>
+        <w:rPr>
+          <w:lang w:val="en-US"/>
+        </w:rPr>
+        <w:t xml:space="preserve"> and </w:t>
+      </w:r>
+      <w:r>
+        <w:rPr>
+          <w:lang w:val="en-US"/>
+        </w:rPr>
+        <w:t>ML</w:t>
       </w:r>
     </w:p>
     <w:p>
@@ -4791,14 +5247,28 @@
           <w:rFonts w:ascii="Times" w:hAnsi="Times"/>
           <w:lang w:val="en-US"/>
         </w:rPr>
-        <w:t xml:space="preserve"> and test</w:t>
-      </w:r>
-      <w:r>
-        <w:rPr>
-          <w:rFonts w:ascii="Times" w:hAnsi="Times"/>
-          <w:lang w:val="en-US"/>
-        </w:rPr>
-        <w:t xml:space="preserve"> the </w:t>
+        <w:t xml:space="preserve">, </w:t>
+      </w:r>
+      <w:r>
+        <w:rPr>
+          <w:rFonts w:ascii="Times" w:hAnsi="Times"/>
+          <w:lang w:val="en-US"/>
+        </w:rPr>
+        <w:t>test</w:t>
+      </w:r>
+      <w:r>
+        <w:rPr>
+          <w:rFonts w:ascii="Times" w:hAnsi="Times"/>
+          <w:lang w:val="en-US"/>
+        </w:rPr>
+        <w:t xml:space="preserve"> and classify</w:t>
+      </w:r>
+      <w:r>
+        <w:rPr>
+          <w:rFonts w:ascii="Times" w:hAnsi="Times"/>
+          <w:lang w:val="en-US"/>
+        </w:rPr>
+        <w:t xml:space="preserve"> </w:t>
       </w:r>
       <w:r>
         <w:rPr>
@@ -4871,7 +5341,14 @@
           <w:rFonts w:ascii="Times" w:hAnsi="Times"/>
           <w:lang w:val="en-US"/>
         </w:rPr>
-        <w:t>0.8</w:t>
+        <w:t>0.</w:t>
+      </w:r>
+      <w:r>
+        <w:rPr>
+          <w:rFonts w:ascii="Times" w:hAnsi="Times"/>
+          <w:lang w:val="en-US"/>
+        </w:rPr>
+        <w:t>75</w:t>
       </w:r>
       <w:r>
         <w:rPr>
@@ -4978,7 +5455,21 @@
           <w:rFonts w:ascii="Times" w:hAnsi="Times"/>
           <w:lang w:val="en-US"/>
         </w:rPr>
-        <w:t xml:space="preserve">and full training were </w:t>
+        <w:t>and full</w:t>
+      </w:r>
+      <w:r>
+        <w:rPr>
+          <w:rFonts w:ascii="Times" w:hAnsi="Times"/>
+          <w:lang w:val="en-US"/>
+        </w:rPr>
+        <w:t>-</w:t>
+      </w:r>
+      <w:r>
+        <w:rPr>
+          <w:rFonts w:ascii="Times" w:hAnsi="Times"/>
+          <w:lang w:val="en-US"/>
+        </w:rPr>
+        <w:t xml:space="preserve">training were </w:t>
       </w:r>
       <w:r>
         <w:rPr>
@@ -5006,7 +5497,7 @@
           <w:rFonts w:ascii="Times" w:hAnsi="Times"/>
           <w:lang w:val="en-US"/>
         </w:rPr>
-        <w:t>. Two novel, SGD+Momentum &amp; Adam, and one recent,</w:t>
+        <w:t>. SGD</w:t>
       </w:r>
       <w:r>
         <w:rPr>
@@ -5020,6 +5511,34 @@
           <w:rFonts w:ascii="Times" w:hAnsi="Times"/>
           <w:lang w:val="en-US"/>
         </w:rPr>
+        <w:t>Momentum</w:t>
+      </w:r>
+      <w:r>
+        <w:rPr>
+          <w:rFonts w:ascii="Times" w:hAnsi="Times"/>
+          <w:lang w:val="en-US"/>
+        </w:rPr>
+        <w:t>,</w:t>
+      </w:r>
+      <w:r>
+        <w:rPr>
+          <w:rFonts w:ascii="Times" w:hAnsi="Times"/>
+          <w:lang w:val="en-US"/>
+        </w:rPr>
+        <w:t xml:space="preserve"> Adam</w:t>
+      </w:r>
+      <w:r>
+        <w:rPr>
+          <w:rFonts w:ascii="Times" w:hAnsi="Times"/>
+          <w:lang w:val="en-US"/>
+        </w:rPr>
+        <w:t xml:space="preserve"> and </w:t>
+      </w:r>
+      <w:r>
+        <w:rPr>
+          <w:rFonts w:ascii="Times" w:hAnsi="Times"/>
+          <w:lang w:val="en-US"/>
+        </w:rPr>
         <w:t>Padam</w:t>
       </w:r>
       <w:r>
@@ -5027,14 +5546,119 @@
           <w:rFonts w:ascii="Times" w:hAnsi="Times"/>
           <w:lang w:val="en-US"/>
         </w:rPr>
-        <w:t xml:space="preserve">, optimizers were used with various learning rate, momentum, partial, betas and weight decay parameter values. </w:t>
+        <w:t xml:space="preserve"> optimizers were used with various learning rate, momentum, partial, betas and weight decay parameter values.</w:t>
+      </w:r>
+      <w:r>
+        <w:rPr>
+          <w:rFonts w:ascii="Times" w:hAnsi="Times"/>
+          <w:lang w:val="en-US"/>
+        </w:rPr>
+        <w:t xml:space="preserve"> </w:t>
+      </w:r>
+      <w:r>
+        <w:rPr>
+          <w:rStyle w:val="viiyi"/>
+          <w:lang w:val="en-US"/>
+        </w:rPr>
+        <w:t xml:space="preserve">Final hyperparameter settings are as follows; learning rate as 0.01 and momentum as  0.9 for SGD Momentum, learning rate as 0.001 for Adam, learning rate as 0.001, partial as 0.125, weight decay as 0.025 and betas as </w:t>
+      </w:r>
+      <w:r>
+        <w:rPr>
+          <w:rStyle w:val="viiyi"/>
+          <w:lang w:val="en-US"/>
+        </w:rPr>
+        <w:t>(0.9, 0.99</w:t>
+      </w:r>
+      <w:r>
+        <w:rPr>
+          <w:rStyle w:val="viiyi"/>
+          <w:lang w:val="en-US"/>
+        </w:rPr>
+        <w:t xml:space="preserve">) for Padam. </w:t>
       </w:r>
       <w:r>
         <w:rPr>
           <w:rStyle w:val="jlqj4b"/>
           <w:lang w:val="en-US"/>
         </w:rPr>
-        <w:t>The learning rate for Adam, Padam, and SGD was 0.001, 0.001 and 0.01, respectively.</w:t>
+        <w:t>Moreover,</w:t>
+      </w:r>
+      <w:r>
+        <w:rPr>
+          <w:rStyle w:val="jlqj4b"/>
+          <w:lang w:val="en-US"/>
+        </w:rPr>
+        <w:t xml:space="preserve"> for Adam and </w:t>
+      </w:r>
+      <w:r>
+        <w:rPr>
+          <w:rStyle w:val="jlqj4b"/>
+          <w:lang w:val="en-US"/>
+        </w:rPr>
+        <w:t>P</w:t>
+      </w:r>
+      <w:r>
+        <w:rPr>
+          <w:rStyle w:val="jlqj4b"/>
+          <w:lang w:val="en-US"/>
+        </w:rPr>
+        <w:t xml:space="preserve">adam, the learning rate was reduced by </w:t>
+      </w:r>
+      <w:r>
+        <w:rPr>
+          <w:rStyle w:val="jlqj4b"/>
+          <w:lang w:val="en-US"/>
+        </w:rPr>
+        <w:t>0.1</w:t>
+      </w:r>
+      <w:r>
+        <w:rPr>
+          <w:rStyle w:val="jlqj4b"/>
+          <w:lang w:val="en-US"/>
+        </w:rPr>
+        <w:t xml:space="preserve"> for </w:t>
+      </w:r>
+      <w:r>
+        <w:rPr>
+          <w:rStyle w:val="jlqj4b"/>
+          <w:lang w:val="en-US"/>
+        </w:rPr>
+        <w:t>each quarter of</w:t>
+      </w:r>
+      <w:r>
+        <w:rPr>
+          <w:rStyle w:val="jlqj4b"/>
+          <w:lang w:val="en-US"/>
+        </w:rPr>
+        <w:t xml:space="preserve"> </w:t>
+      </w:r>
+      <w:r>
+        <w:rPr>
+          <w:rStyle w:val="jlqj4b"/>
+          <w:lang w:val="en-US"/>
+        </w:rPr>
+        <w:t>total</w:t>
+      </w:r>
+      <w:r>
+        <w:rPr>
+          <w:rStyle w:val="jlqj4b"/>
+          <w:lang w:val="en-US"/>
+        </w:rPr>
+        <w:t xml:space="preserve"> epoch</w:t>
+      </w:r>
+      <w:r>
+        <w:rPr>
+          <w:rStyle w:val="jlqj4b"/>
+          <w:lang w:val="en-US"/>
+        </w:rPr>
+        <w:t xml:space="preserve"> size</w:t>
+      </w:r>
+      <w:r>
+        <w:rPr>
+          <w:rStyle w:val="jlqj4b"/>
+          <w:lang w:val="en-US"/>
+        </w:rPr>
+        <w:t>.</w:t>
       </w:r>
       <w:r>
         <w:rPr>
@@ -5048,98 +5672,91 @@
           <w:rStyle w:val="jlqj4b"/>
           <w:lang w:val="en-US"/>
         </w:rPr>
-        <w:t>Moreover,</w:t>
+        <w:t>For example, in a 200 epoch</w:t>
       </w:r>
       <w:r>
         <w:rPr>
           <w:rStyle w:val="jlqj4b"/>
           <w:lang w:val="en-US"/>
         </w:rPr>
-        <w:t xml:space="preserve"> for Adam and </w:t>
+        <w:t>s</w:t>
       </w:r>
       <w:r>
         <w:rPr>
           <w:rStyle w:val="jlqj4b"/>
           <w:lang w:val="en-US"/>
         </w:rPr>
-        <w:t>P</w:t>
+        <w:t xml:space="preserve"> training, if </w:t>
       </w:r>
       <w:r>
         <w:rPr>
           <w:rStyle w:val="jlqj4b"/>
           <w:lang w:val="en-US"/>
         </w:rPr>
-        <w:t xml:space="preserve">adam, the learning rate was reduced by 1/10 for </w:t>
+        <w:t xml:space="preserve">one </w:t>
       </w:r>
       <w:r>
         <w:rPr>
           <w:rStyle w:val="jlqj4b"/>
           <w:lang w:val="en-US"/>
         </w:rPr>
-        <w:t>each quarter of</w:t>
+        <w:t xml:space="preserve">started with lr = </w:t>
       </w:r>
       <w:r>
         <w:rPr>
           <w:rStyle w:val="jlqj4b"/>
           <w:lang w:val="en-US"/>
         </w:rPr>
-        <w:t xml:space="preserve"> </w:t>
+        <w:t>1e-2</w:t>
       </w:r>
       <w:r>
         <w:rPr>
           <w:rStyle w:val="jlqj4b"/>
           <w:lang w:val="en-US"/>
         </w:rPr>
-        <w:t>total</w:t>
+        <w:t xml:space="preserve">, it is updated to </w:t>
       </w:r>
       <w:r>
         <w:rPr>
           <w:rStyle w:val="jlqj4b"/>
           <w:lang w:val="en-US"/>
         </w:rPr>
-        <w:t xml:space="preserve"> epoch</w:t>
+        <w:t>1e-3</w:t>
       </w:r>
       <w:r>
         <w:rPr>
           <w:rStyle w:val="jlqj4b"/>
           <w:lang w:val="en-US"/>
         </w:rPr>
-        <w:t xml:space="preserve"> size</w:t>
+        <w:t xml:space="preserve"> in epoch 50, </w:t>
       </w:r>
       <w:r>
         <w:rPr>
           <w:rStyle w:val="jlqj4b"/>
           <w:lang w:val="en-US"/>
         </w:rPr>
-        <w:t>.</w:t>
-      </w:r>
-      <w:r>
-        <w:rPr>
-          <w:rStyle w:val="viiyi"/>
-          <w:lang w:val="en-US"/>
-        </w:rPr>
-        <w:t xml:space="preserve"> </w:t>
+        <w:t>1e-4</w:t>
       </w:r>
       <w:r>
         <w:rPr>
           <w:rStyle w:val="jlqj4b"/>
           <w:lang w:val="en-US"/>
         </w:rPr>
-        <w:t>For example, in a 200 epoch</w:t>
+        <w:t xml:space="preserve"> in epoch 100, and </w:t>
       </w:r>
       <w:r>
         <w:rPr>
           <w:rStyle w:val="jlqj4b"/>
           <w:lang w:val="en-US"/>
         </w:rPr>
-        <w:t>s</w:t>
+        <w:t>1e-5</w:t>
       </w:r>
       <w:r>
         <w:rPr>
           <w:rStyle w:val="jlqj4b"/>
           <w:lang w:val="en-US"/>
         </w:rPr>
-        <w:t xml:space="preserve"> training, if started with lr = 0.001, it is updated to 0.0001 in epoch 50, 0.00001 in epoch 100, and 0.000001 in epoch 150.</w:t>
+        <w:t xml:space="preserve"> in epoch 150.</w:t>
       </w:r>
       <w:r>
         <w:rPr>
@@ -5160,13 +5777,85 @@
         <w:rPr>
           <w:lang w:val="en-US"/>
         </w:rPr>
-        <w:t xml:space="preserve">Each experiment was run on 200 epochs with validation using testing data once in 10 epochs. Moreover, on each validation and the final test, </w:t>
-      </w:r>
-      <w:r>
-        <w:rPr>
-          <w:lang w:val="en-US"/>
-        </w:rPr>
-        <w:t>the accuracy was compared to previously stored results and saved as a new weight file if it is better than the older.</w:t>
+        <w:t>Cross</w:t>
+      </w:r>
+      <w:r>
+        <w:rPr>
+          <w:lang w:val="en-US"/>
+        </w:rPr>
+        <w:t>-E</w:t>
+      </w:r>
+      <w:r>
+        <w:rPr>
+          <w:lang w:val="en-US"/>
+        </w:rPr>
+        <w:t xml:space="preserve">ntropy </w:t>
+      </w:r>
+      <w:r>
+        <w:rPr>
+          <w:lang w:val="en-US"/>
+        </w:rPr>
+        <w:t>L</w:t>
+      </w:r>
+      <w:r>
+        <w:rPr>
+          <w:lang w:val="en-US"/>
+        </w:rPr>
+        <w:t>oss as the combination of Log SoftMax and N</w:t>
+      </w:r>
+      <w:r>
+        <w:rPr>
+          <w:lang w:val="en-US"/>
+        </w:rPr>
+        <w:t xml:space="preserve">egative </w:t>
+      </w:r>
+      <w:r>
+        <w:rPr>
+          <w:lang w:val="en-US"/>
+        </w:rPr>
+        <w:t>L</w:t>
+      </w:r>
+      <w:r>
+        <w:rPr>
+          <w:lang w:val="en-US"/>
+        </w:rPr>
+        <w:t xml:space="preserve">og </w:t>
+      </w:r>
+      <w:r>
+        <w:rPr>
+          <w:lang w:val="en-US"/>
+        </w:rPr>
+        <w:t>L</w:t>
+      </w:r>
+      <w:r>
+        <w:rPr>
+          <w:lang w:val="en-US"/>
+        </w:rPr>
+        <w:t xml:space="preserve">ikelihood </w:t>
+      </w:r>
+      <w:r>
+        <w:rPr>
+          <w:lang w:val="en-US"/>
+        </w:rPr>
+        <w:t>L</w:t>
+      </w:r>
+      <w:r>
+        <w:rPr>
+          <w:lang w:val="en-US"/>
+        </w:rPr>
+        <w:t>oss</w:t>
+      </w:r>
+      <w:r>
+        <w:rPr>
+          <w:lang w:val="en-US"/>
+        </w:rPr>
+        <w:t xml:space="preserve"> was used </w:t>
+      </w:r>
+      <w:r>
+        <w:rPr>
+          <w:lang w:val="en-US"/>
+        </w:rPr>
+        <w:t>as optimization method.</w:t>
       </w:r>
     </w:p>
     <w:p>
@@ -5181,19 +5870,49 @@
         <w:rPr>
           <w:lang w:val="en-US"/>
         </w:rPr>
-        <w:t>On</w:t>
-      </w:r>
-      <w:r>
-        <w:rPr>
-          <w:lang w:val="en-US"/>
-        </w:rPr>
-        <w:t xml:space="preserve"> the</w:t>
-      </w:r>
-      <w:r>
-        <w:rPr>
-          <w:lang w:val="en-US"/>
-        </w:rPr>
-        <w:t xml:space="preserve"> 10-fold cross validation partitioning for</w:t>
+        <w:t xml:space="preserve">Each experiment was run on 200 epochs with validation using test data once in 10 epochs. Moreover, on each validation and the final test, </w:t>
+      </w:r>
+      <w:r>
+        <w:rPr>
+          <w:lang w:val="en-US"/>
+        </w:rPr>
+        <w:t xml:space="preserve">the accuracy was compared </w:t>
+      </w:r>
+      <w:r>
+        <w:rPr>
+          <w:lang w:val="en-US"/>
+        </w:rPr>
+        <w:t>with the</w:t>
+      </w:r>
+      <w:r>
+        <w:rPr>
+          <w:lang w:val="en-US"/>
+        </w:rPr>
+        <w:t xml:space="preserve"> previously stored results and saved as a new </w:t>
+      </w:r>
+      <w:r>
+        <w:rPr>
+          <w:lang w:val="en-US"/>
+        </w:rPr>
+        <w:t xml:space="preserve">model </w:t>
+      </w:r>
+      <w:r>
+        <w:rPr>
+          <w:lang w:val="en-US"/>
+        </w:rPr>
+        <w:t>weight</w:t>
+      </w:r>
+      <w:r>
+        <w:rPr>
+          <w:lang w:val="en-US"/>
+        </w:rPr>
+        <w:t xml:space="preserve"> *.pth</w:t>
+      </w:r>
+      <w:r>
+        <w:rPr>
+          <w:lang w:val="en-US"/>
+        </w:rPr>
+        <w:t xml:space="preserve"> file if it is better than the older.</w:t>
       </w:r>
       <w:r>
         <w:rPr>
@@ -5201,24 +5920,133 @@
         </w:rPr>
         <w:t xml:space="preserve"> </w:t>
       </w:r>
-      <w:r>
-        <w:rPr>
-          <w:lang w:val="en-US"/>
-        </w:rPr>
-        <w:t xml:space="preserve">ML algorithms, seed was set to </w:t>
-      </w:r>
-      <w:r>
-        <w:rPr>
-          <w:lang w:val="en-US"/>
-        </w:rPr>
-        <w:t>17</w:t>
-      </w:r>
-      <w:r>
-        <w:rPr>
-          <w:lang w:val="en-US"/>
-        </w:rPr>
-        <w:t xml:space="preserve"> in order to prevent the result consistency. </w:t>
-      </w:r>
+    </w:p>
+    <w:p>
+      <w:pPr>
+        <w:spacing w:line="276" w:lineRule="auto"/>
+        <w:jc w:val="center"/>
+        <w:rPr>
+          <w:rFonts w:ascii="Times" w:hAnsi="Times"/>
+          <w:lang w:val="en-US"/>
+        </w:rPr>
+      </w:pPr>
+    </w:p>
+    <w:p>
+      <w:pPr>
+        <w:spacing w:line="276" w:lineRule="auto"/>
+        <w:jc w:val="center"/>
+        <w:rPr>
+          <w:rFonts w:ascii="Times" w:hAnsi="Times"/>
+          <w:lang w:val="en-US"/>
+        </w:rPr>
+      </w:pPr>
+    </w:p>
+    <w:p>
+      <w:pPr>
+        <w:spacing w:line="276" w:lineRule="auto"/>
+        <w:jc w:val="center"/>
+        <w:rPr>
+          <w:rFonts w:ascii="Times" w:hAnsi="Times"/>
+          <w:lang w:val="en-US"/>
+        </w:rPr>
+      </w:pPr>
+    </w:p>
+    <w:p>
+      <w:pPr>
+        <w:spacing w:line="276" w:lineRule="auto"/>
+        <w:jc w:val="center"/>
+        <w:rPr>
+          <w:rFonts w:ascii="Times" w:hAnsi="Times"/>
+          <w:lang w:val="en-US"/>
+        </w:rPr>
+      </w:pPr>
+    </w:p>
+    <w:p>
+      <w:pPr>
+        <w:spacing w:line="276" w:lineRule="auto"/>
+        <w:jc w:val="center"/>
+        <w:rPr>
+          <w:rFonts w:ascii="Times" w:hAnsi="Times"/>
+          <w:lang w:val="en-US"/>
+        </w:rPr>
+      </w:pPr>
+      <w:r>
+        <w:rPr>
+          <w:rFonts w:ascii="Times" w:hAnsi="Times"/>
+          <w:lang w:val="en-US"/>
+        </w:rPr>
+        <w:t>## CROSS-ENTROPY LOSS WILL BE PLACED HERE</w:t>
+      </w:r>
+    </w:p>
+    <w:p>
+      <w:pPr>
+        <w:spacing w:line="276" w:lineRule="auto"/>
+        <w:jc w:val="center"/>
+        <w:rPr>
+          <w:rFonts w:ascii="Times" w:hAnsi="Times"/>
+          <w:lang w:val="en-US"/>
+        </w:rPr>
+      </w:pPr>
+    </w:p>
+    <w:p>
+      <w:pPr>
+        <w:spacing w:line="276" w:lineRule="auto"/>
+        <w:jc w:val="center"/>
+        <w:rPr>
+          <w:rFonts w:ascii="Times" w:hAnsi="Times"/>
+          <w:lang w:val="en-US"/>
+        </w:rPr>
+      </w:pPr>
+    </w:p>
+    <w:p>
+      <w:pPr>
+        <w:spacing w:line="276" w:lineRule="auto"/>
+        <w:jc w:val="center"/>
+        <w:rPr>
+          <w:rFonts w:ascii="Times" w:hAnsi="Times"/>
+          <w:lang w:val="en-US"/>
+        </w:rPr>
+      </w:pPr>
+    </w:p>
+    <w:p>
+      <w:pPr>
+        <w:spacing w:line="276" w:lineRule="auto"/>
+        <w:jc w:val="center"/>
+        <w:rPr>
+          <w:rFonts w:ascii="Times" w:hAnsi="Times"/>
+          <w:lang w:val="en-US"/>
+        </w:rPr>
+      </w:pPr>
+    </w:p>
+    <w:p>
+      <w:pPr>
+        <w:spacing w:line="276" w:lineRule="auto"/>
+        <w:jc w:val="center"/>
+        <w:rPr>
+          <w:rFonts w:ascii="Times" w:hAnsi="Times"/>
+          <w:lang w:val="en-US"/>
+        </w:rPr>
+      </w:pPr>
+    </w:p>
+    <w:p>
+      <w:pPr>
+        <w:spacing w:line="276" w:lineRule="auto"/>
+        <w:jc w:val="center"/>
+        <w:rPr>
+          <w:rFonts w:ascii="Times" w:hAnsi="Times"/>
+          <w:lang w:val="en-US"/>
+        </w:rPr>
+      </w:pPr>
+    </w:p>
+    <w:p>
+      <w:pPr>
+        <w:spacing w:line="276" w:lineRule="auto"/>
+        <w:jc w:val="center"/>
+        <w:rPr>
+          <w:rFonts w:ascii="Times" w:hAnsi="Times"/>
+          <w:lang w:val="en-US"/>
+        </w:rPr>
+      </w:pPr>
     </w:p>
     <w:p>
       <w:pPr>
@@ -5228,24 +6056,35 @@
           <w:lang w:val="en-US"/>
         </w:rPr>
       </w:pPr>
-      <w:r>
-        <w:rPr>
-          <w:lang w:val="en-US"/>
-        </w:rPr>
-        <w:lastRenderedPageBreak/>
-        <w:t xml:space="preserve">After getting results from pre-trained CNN models, feature extraction via the best CNN model was applied to whole dataset. Then by using </w:t>
-      </w:r>
-      <w:r>
-        <w:rPr>
-          <w:lang w:val="en-US"/>
-        </w:rPr>
-        <w:t>10-fold cross validation</w:t>
-      </w:r>
-      <w:r>
-        <w:rPr>
-          <w:lang w:val="en-US"/>
-        </w:rPr>
-        <w:t>, SVM, LR and kNN were performed on extracted feature sets.</w:t>
+    </w:p>
+    <w:p>
+      <w:pPr>
+        <w:spacing w:line="276" w:lineRule="auto"/>
+        <w:jc w:val="both"/>
+        <w:rPr>
+          <w:lang w:val="en-US"/>
+        </w:rPr>
+      </w:pPr>
+      <w:r>
+        <w:rPr>
+          <w:lang w:val="en-US"/>
+        </w:rPr>
+        <w:t xml:space="preserve">On the 10-fold cross validation partitioning for ML algorithms, seed was set to 17 in order to prevent the result consistency. </w:t>
+      </w:r>
+    </w:p>
+    <w:p>
+      <w:pPr>
+        <w:spacing w:line="276" w:lineRule="auto"/>
+        <w:jc w:val="both"/>
+        <w:rPr>
+          <w:lang w:val="en-US"/>
+        </w:rPr>
+      </w:pPr>
+      <w:r>
+        <w:rPr>
+          <w:lang w:val="en-US"/>
+        </w:rPr>
+        <w:t>After getting results from pre-trained CNN models, feature extraction via the best CNN model was applied to whole dataset. Then by using 10-fold cross validation, SVM, LR and kNN were performed on extracted feature sets.</w:t>
       </w:r>
     </w:p>
     <w:p>
@@ -5882,6 +6721,15 @@
     <w:p>
       <w:pPr>
         <w:spacing w:line="276" w:lineRule="auto"/>
+        <w:rPr>
+          <w:rFonts w:ascii="Times" w:hAnsi="Times"/>
+          <w:lang w:val="en-US"/>
+        </w:rPr>
+      </w:pPr>
+    </w:p>
+    <w:p>
+      <w:pPr>
+        <w:spacing w:line="276" w:lineRule="auto"/>
         <w:jc w:val="center"/>
         <w:rPr>
           <w:rFonts w:ascii="Times" w:hAnsi="Times"/>
@@ -6200,21 +7048,49 @@
           <w:rFonts w:ascii="Times" w:hAnsi="Times"/>
           <w:lang w:val="en-US"/>
         </w:rPr>
-        <w:t>The training</w:t>
-      </w:r>
-      <w:r>
-        <w:rPr>
-          <w:rFonts w:ascii="Times" w:hAnsi="Times"/>
-          <w:lang w:val="en-US"/>
-        </w:rPr>
-        <w:t xml:space="preserve"> accuracy, Validation and</w:t>
-      </w:r>
-      <w:r>
-        <w:rPr>
-          <w:rFonts w:ascii="Times" w:hAnsi="Times"/>
-          <w:lang w:val="en-US"/>
-        </w:rPr>
-        <w:t xml:space="preserve"> loss values of ResNet18, AlexNet</w:t>
+        <w:t xml:space="preserve">The </w:t>
+      </w:r>
+      <w:r>
+        <w:rPr>
+          <w:rFonts w:ascii="Times" w:hAnsi="Times"/>
+          <w:lang w:val="en-US"/>
+        </w:rPr>
+        <w:t xml:space="preserve">accuracy and loss values of </w:t>
+      </w:r>
+      <w:r>
+        <w:rPr>
+          <w:rFonts w:ascii="Times" w:hAnsi="Times"/>
+          <w:lang w:val="en-US"/>
+        </w:rPr>
+        <w:t>training</w:t>
+      </w:r>
+      <w:r>
+        <w:rPr>
+          <w:rFonts w:ascii="Times" w:hAnsi="Times"/>
+          <w:lang w:val="en-US"/>
+        </w:rPr>
+        <w:t xml:space="preserve"> and validation</w:t>
+      </w:r>
+      <w:r>
+        <w:rPr>
+          <w:rFonts w:ascii="Times" w:hAnsi="Times"/>
+          <w:lang w:val="en-US"/>
+        </w:rPr>
+        <w:t xml:space="preserve"> </w:t>
+      </w:r>
+      <w:r>
+        <w:rPr>
+          <w:rFonts w:ascii="Times" w:hAnsi="Times"/>
+          <w:lang w:val="en-US"/>
+        </w:rPr>
+        <w:t>stages</w:t>
+      </w:r>
+      <w:r>
+        <w:rPr>
+          <w:rFonts w:ascii="Times" w:hAnsi="Times"/>
+          <w:lang w:val="en-US"/>
+        </w:rPr>
+        <w:t xml:space="preserve"> of ResNet18, AlexNet</w:t>
       </w:r>
       <w:r>
         <w:rPr>
@@ -6288,7 +7164,7 @@
       </w:r>
       <w:r>
         <w:rPr>
-          <w:color w:val="4472C4" w:themeColor="accent1"/>
+          <w:color w:val="002060"/>
           <w:lang w:val="en-US"/>
         </w:rPr>
         <w:t>Adam</w:t>
@@ -6325,16 +7201,6 @@
         </w:rPr>
         <w:t xml:space="preserve"> are as specified here.</w:t>
       </w:r>
-    </w:p>
-    <w:p>
-      <w:pPr>
-        <w:spacing w:line="276" w:lineRule="auto"/>
-        <w:jc w:val="both"/>
-        <w:rPr>
-          <w:rFonts w:ascii="Times" w:hAnsi="Times"/>
-          <w:lang w:val="en-US"/>
-        </w:rPr>
-      </w:pPr>
     </w:p>
     <w:p>
       <w:pPr>
@@ -6351,6 +7217,7 @@
           <w:noProof/>
           <w:lang w:val="en-US"/>
         </w:rPr>
+        <w:lastRenderedPageBreak/>
         <w:drawing>
           <wp:inline distT="0" distB="0" distL="0" distR="0" wp14:anchorId="2BA988CA" wp14:editId="10AA55D7">
             <wp:extent cx="2772197" cy="1261284"/>
@@ -7108,6 +7975,7 @@
           <w:noProof/>
           <w:lang w:val="en-US"/>
         </w:rPr>
+        <w:lastRenderedPageBreak/>
         <w:drawing>
           <wp:inline distT="0" distB="0" distL="0" distR="0" wp14:anchorId="68F4E0A7" wp14:editId="19F44BD7">
             <wp:extent cx="2603090" cy="1184684"/>
@@ -7355,7 +8223,6 @@
           <w:noProof/>
           <w:lang w:val="en-US"/>
         </w:rPr>
-        <w:lastRenderedPageBreak/>
         <w:drawing>
           <wp:inline distT="0" distB="0" distL="0" distR="0" wp14:anchorId="70BB574E" wp14:editId="0021650A">
             <wp:extent cx="2639961" cy="1199718"/>
@@ -7581,16 +8448,6 @@
     <w:p>
       <w:pPr>
         <w:spacing w:line="276" w:lineRule="auto"/>
-        <w:jc w:val="center"/>
-        <w:rPr>
-          <w:rFonts w:ascii="Times" w:hAnsi="Times"/>
-          <w:lang w:val="en-US"/>
-        </w:rPr>
-      </w:pPr>
-    </w:p>
-    <w:p>
-      <w:pPr>
-        <w:spacing w:line="276" w:lineRule="auto"/>
         <w:jc w:val="both"/>
         <w:rPr>
           <w:rFonts w:ascii="Times" w:hAnsi="Times"/>
@@ -7851,6 +8708,15 @@
             <w:r>
               <w:rPr>
                 <w:rFonts w:ascii="Times" w:hAnsi="Times"/>
+                <w:b/>
+                <w:bCs/>
+                <w:lang w:val="en-US"/>
+              </w:rPr>
+              <w:t>*</w:t>
+            </w:r>
+            <w:r>
+              <w:rPr>
+                <w:rFonts w:ascii="Times" w:hAnsi="Times"/>
                 <w:lang w:val="en-US"/>
               </w:rPr>
               <w:t>84.</w:t>
@@ -8203,6 +9069,15 @@
             <w:r>
               <w:rPr>
                 <w:rFonts w:ascii="Times" w:hAnsi="Times"/>
+                <w:b/>
+                <w:bCs/>
+                <w:lang w:val="en-US"/>
+              </w:rPr>
+              <w:t>*</w:t>
+            </w:r>
+            <w:r>
+              <w:rPr>
+                <w:rFonts w:ascii="Times" w:hAnsi="Times"/>
                 <w:lang w:val="en-US"/>
               </w:rPr>
               <w:t>83.33 (30 epoch)</w:t>
@@ -8224,6 +9099,15 @@
                 <w:lang w:val="en-US"/>
               </w:rPr>
             </w:pPr>
+            <w:r>
+              <w:rPr>
+                <w:rFonts w:ascii="Times" w:hAnsi="Times"/>
+                <w:b/>
+                <w:bCs/>
+                <w:lang w:val="en-US"/>
+              </w:rPr>
+              <w:t>*</w:t>
+            </w:r>
             <w:r>
               <w:rPr>
                 <w:rFonts w:ascii="Times" w:hAnsi="Times"/>
@@ -8446,28 +9330,29 @@
           <w:rStyle w:val="jlqj4b"/>
           <w:lang w:val="en-US"/>
         </w:rPr>
-        <w:t>ResNet18 pre-trained model and ML algorithms were combined and the results were obtained. Results are as follows.</w:t>
+        <w:t xml:space="preserve">ResNet18 pre-trained model and ML algorithms were combined and the results were obtained. </w:t>
       </w:r>
       <w:r>
         <w:rPr>
           <w:rStyle w:val="jlqj4b"/>
           <w:lang w:val="en-US"/>
         </w:rPr>
-        <w:t xml:space="preserve"> Feature extraction were performed by the cut of the feature block of Torchvision model ResNet</w:t>
+        <w:t xml:space="preserve">Feature extraction were performed by the cut of the feature </w:t>
       </w:r>
       <w:r>
         <w:rPr>
           <w:rStyle w:val="jlqj4b"/>
           <w:lang w:val="en-US"/>
         </w:rPr>
-        <w:t>, and 512 features were obtained for each sample</w:t>
+        <w:lastRenderedPageBreak/>
+        <w:t>block of model ResNet</w:t>
       </w:r>
       <w:r>
         <w:rPr>
           <w:rStyle w:val="jlqj4b"/>
           <w:lang w:val="en-US"/>
         </w:rPr>
-        <w:t>.</w:t>
+        <w:t>, and 2D Adaptive Average Pooling and finally flattening.</w:t>
       </w:r>
       <w:r>
         <w:rPr>
@@ -8476,87 +9361,34 @@
         </w:rPr>
         <w:t xml:space="preserve"> </w:t>
       </w:r>
-    </w:p>
-    <w:p>
-      <w:pPr>
-        <w:spacing w:line="276" w:lineRule="auto"/>
+      <w:r>
         <w:rPr>
           <w:rStyle w:val="jlqj4b"/>
           <w:lang w:val="en-US"/>
         </w:rPr>
-      </w:pPr>
-    </w:p>
-    <w:p>
-      <w:pPr>
-        <w:spacing w:line="276" w:lineRule="auto"/>
+        <w:t>In the end,</w:t>
+      </w:r>
+      <w:r>
         <w:rPr>
           <w:rStyle w:val="jlqj4b"/>
           <w:lang w:val="en-US"/>
         </w:rPr>
-      </w:pPr>
-    </w:p>
-    <w:p>
-      <w:pPr>
-        <w:spacing w:line="276" w:lineRule="auto"/>
+        <w:t xml:space="preserve"> 512 features were obtained for each sample. </w:t>
+      </w:r>
+      <w:r>
         <w:rPr>
           <w:rStyle w:val="jlqj4b"/>
           <w:lang w:val="en-US"/>
         </w:rPr>
-      </w:pPr>
-    </w:p>
-    <w:p>
-      <w:pPr>
-        <w:spacing w:line="276" w:lineRule="auto"/>
+        <w:t>Results are as follows.</w:t>
+      </w:r>
+      <w:r>
         <w:rPr>
           <w:rStyle w:val="jlqj4b"/>
           <w:lang w:val="en-US"/>
         </w:rPr>
-      </w:pPr>
-    </w:p>
-    <w:p>
-      <w:pPr>
-        <w:spacing w:line="276" w:lineRule="auto"/>
-        <w:rPr>
-          <w:rStyle w:val="jlqj4b"/>
-          <w:lang w:val="en-US"/>
-        </w:rPr>
-      </w:pPr>
-    </w:p>
-    <w:p>
-      <w:pPr>
-        <w:spacing w:line="276" w:lineRule="auto"/>
-        <w:rPr>
-          <w:rStyle w:val="jlqj4b"/>
-          <w:lang w:val="en-US"/>
-        </w:rPr>
-      </w:pPr>
-    </w:p>
-    <w:p>
-      <w:pPr>
-        <w:spacing w:line="276" w:lineRule="auto"/>
-        <w:rPr>
-          <w:rStyle w:val="jlqj4b"/>
-          <w:lang w:val="en-US"/>
-        </w:rPr>
-      </w:pPr>
-    </w:p>
-    <w:p>
-      <w:pPr>
-        <w:spacing w:line="276" w:lineRule="auto"/>
-        <w:rPr>
-          <w:rStyle w:val="jlqj4b"/>
-          <w:lang w:val="en-US"/>
-        </w:rPr>
-      </w:pPr>
-    </w:p>
-    <w:p>
-      <w:pPr>
-        <w:spacing w:line="276" w:lineRule="auto"/>
-        <w:rPr>
-          <w:rStyle w:val="jlqj4b"/>
-          <w:lang w:val="en-US"/>
-        </w:rPr>
-      </w:pPr>
+        <w:t xml:space="preserve"> </w:t>
+      </w:r>
     </w:p>
     <w:p>
       <w:pPr>
@@ -8582,7 +9414,6 @@
           <w:bCs/>
           <w:lang w:val="en-US"/>
         </w:rPr>
-        <w:lastRenderedPageBreak/>
         <w:t>Table 3</w:t>
       </w:r>
       <w:r>
@@ -9847,15 +10678,7 @@
                 <w:szCs w:val="20"/>
                 <w:lang w:val="en-US"/>
               </w:rPr>
-              <w:t>9</w:t>
-            </w:r>
-            <w:r>
-              <w:rPr>
-                <w:rFonts w:ascii="Times" w:hAnsi="Times"/>
-                <w:sz w:val="20"/>
-                <w:szCs w:val="20"/>
-              </w:rPr>
-              <w:t>5.96</w:t>
+              <w:t>95.96</w:t>
             </w:r>
           </w:p>
         </w:tc>
@@ -9885,15 +10708,7 @@
                 <w:szCs w:val="20"/>
                 <w:lang w:val="en-US"/>
               </w:rPr>
-              <w:t>9</w:t>
-            </w:r>
-            <w:r>
-              <w:rPr>
-                <w:rFonts w:ascii="Times" w:hAnsi="Times"/>
-                <w:sz w:val="20"/>
-                <w:szCs w:val="20"/>
-              </w:rPr>
-              <w:t>7.85</w:t>
+              <w:t>97.85</w:t>
             </w:r>
           </w:p>
         </w:tc>
@@ -9923,15 +10738,7 @@
                 <w:szCs w:val="20"/>
                 <w:lang w:val="en-US"/>
               </w:rPr>
-              <w:t>9</w:t>
-            </w:r>
-            <w:r>
-              <w:rPr>
-                <w:rFonts w:ascii="Times" w:hAnsi="Times"/>
-                <w:sz w:val="20"/>
-                <w:szCs w:val="20"/>
-              </w:rPr>
-              <w:t>4.29</w:t>
+              <w:t>94.29</w:t>
             </w:r>
           </w:p>
         </w:tc>
@@ -10019,17 +10826,7 @@
                 <w:szCs w:val="20"/>
                 <w:lang w:val="en-US"/>
               </w:rPr>
-              <w:t>9</w:t>
-            </w:r>
-            <w:r>
-              <w:rPr>
-                <w:rFonts w:ascii="Times" w:hAnsi="Times"/>
-                <w:b/>
-                <w:bCs/>
-                <w:sz w:val="20"/>
-                <w:szCs w:val="20"/>
-              </w:rPr>
-              <w:t>6.05</w:t>
+              <w:t>96.05</w:t>
             </w:r>
           </w:p>
         </w:tc>
@@ -10060,17 +10857,7 @@
                 <w:szCs w:val="20"/>
                 <w:lang w:val="en-US"/>
               </w:rPr>
-              <w:t>9</w:t>
-            </w:r>
-            <w:r>
-              <w:rPr>
-                <w:rFonts w:ascii="Times" w:hAnsi="Times"/>
-                <w:b/>
-                <w:bCs/>
-                <w:sz w:val="20"/>
-                <w:szCs w:val="20"/>
-              </w:rPr>
-              <w:t>7.85</w:t>
+              <w:t>97.85</w:t>
             </w:r>
           </w:p>
         </w:tc>
@@ -10101,17 +10888,7 @@
                 <w:szCs w:val="20"/>
                 <w:lang w:val="en-US"/>
               </w:rPr>
-              <w:t>9</w:t>
-            </w:r>
-            <w:r>
-              <w:rPr>
-                <w:rFonts w:ascii="Times" w:hAnsi="Times"/>
-                <w:b/>
-                <w:bCs/>
-                <w:sz w:val="20"/>
-                <w:szCs w:val="20"/>
-              </w:rPr>
-              <w:t>4.44</w:t>
+              <w:t>94.44</w:t>
             </w:r>
           </w:p>
         </w:tc>
@@ -11004,26 +11781,6 @@
     </w:p>
     <w:p>
       <w:pPr>
-        <w:spacing w:line="276" w:lineRule="auto"/>
-        <w:jc w:val="both"/>
-        <w:rPr>
-          <w:rFonts w:ascii="Times" w:hAnsi="Times"/>
-          <w:lang w:val="en-US"/>
-        </w:rPr>
-      </w:pPr>
-    </w:p>
-    <w:p>
-      <w:pPr>
-        <w:spacing w:line="276" w:lineRule="auto"/>
-        <w:jc w:val="both"/>
-        <w:rPr>
-          <w:rFonts w:ascii="Times" w:hAnsi="Times"/>
-          <w:lang w:val="en-US"/>
-        </w:rPr>
-      </w:pPr>
-    </w:p>
-    <w:p>
-      <w:pPr>
         <w:pStyle w:val="ListParagraph"/>
         <w:numPr>
           <w:ilvl w:val="0"/>
@@ -11130,6 +11887,7 @@
         <w:spacing w:line="276" w:lineRule="auto"/>
         <w:jc w:val="both"/>
         <w:rPr>
+          <w:rStyle w:val="jlqj4b"/>
           <w:lang w:val="en-US"/>
         </w:rPr>
       </w:pPr>
@@ -11180,7 +11938,35 @@
           <w:rStyle w:val="jlqj4b"/>
           <w:lang w:val="en-US"/>
         </w:rPr>
-        <w:t>All pre-trained models were trained with Adam, Padam and SGD optimizer, and results were obtained.</w:t>
+        <w:t>All pre-trained models were trained with Adam, Padam and SGD</w:t>
+      </w:r>
+      <w:r>
+        <w:rPr>
+          <w:rStyle w:val="jlqj4b"/>
+          <w:lang w:val="en-US"/>
+        </w:rPr>
+        <w:t xml:space="preserve"> Momentum</w:t>
+      </w:r>
+      <w:r>
+        <w:rPr>
+          <w:rStyle w:val="jlqj4b"/>
+          <w:lang w:val="en-US"/>
+        </w:rPr>
+        <w:t xml:space="preserve"> optimizer</w:t>
+      </w:r>
+      <w:r>
+        <w:rPr>
+          <w:rStyle w:val="jlqj4b"/>
+          <w:lang w:val="en-US"/>
+        </w:rPr>
+        <w:t>, and Cross-Entropy method,</w:t>
+      </w:r>
+      <w:r>
+        <w:rPr>
+          <w:rStyle w:val="jlqj4b"/>
+          <w:lang w:val="en-US"/>
+        </w:rPr>
+        <w:t xml:space="preserve"> and results were obtained.</w:t>
       </w:r>
       <w:r>
         <w:rPr>
@@ -11194,7 +11980,21 @@
           <w:rStyle w:val="jlqj4b"/>
           <w:lang w:val="en-US"/>
         </w:rPr>
-        <w:t>At this stage, the best result was obtained by using Adam in ResNet18 model with 84.01%.</w:t>
+        <w:t>At this stage, the best result was obtained by using Adam in ResNet18 model with 84.</w:t>
+      </w:r>
+      <w:r>
+        <w:rPr>
+          <w:rStyle w:val="jlqj4b"/>
+          <w:lang w:val="en-US"/>
+        </w:rPr>
+        <w:t>35</w:t>
+      </w:r>
+      <w:r>
+        <w:rPr>
+          <w:rStyle w:val="jlqj4b"/>
+          <w:lang w:val="en-US"/>
+        </w:rPr>
+        <w:t>%.</w:t>
       </w:r>
       <w:r>
         <w:rPr>
@@ -11208,13 +12008,27 @@
           <w:rStyle w:val="jlqj4b"/>
           <w:lang w:val="en-US"/>
         </w:rPr>
-        <w:t xml:space="preserve">In the CNN model, the convergence speed for Adam, Padam, SGD </w:t>
+        <w:t>In the CNN model, the convergence speed for Adam, Padam, SGD</w:t>
       </w:r>
       <w:r>
         <w:rPr>
           <w:rStyle w:val="jlqj4b"/>
           <w:lang w:val="en-US"/>
         </w:rPr>
+        <w:t xml:space="preserve"> Momentum</w:t>
+      </w:r>
+      <w:r>
+        <w:rPr>
+          <w:rStyle w:val="jlqj4b"/>
+          <w:lang w:val="en-US"/>
+        </w:rPr>
+        <w:t xml:space="preserve"> </w:t>
+      </w:r>
+      <w:r>
+        <w:rPr>
+          <w:rStyle w:val="jlqj4b"/>
+          <w:lang w:val="en-US"/>
+        </w:rPr>
         <w:t>was</w:t>
       </w:r>
       <w:r>
@@ -11235,7 +12049,35 @@
           <w:rStyle w:val="jlqj4b"/>
           <w:lang w:val="en-US"/>
         </w:rPr>
-        <w:t>In phase 2, ResNet18 pre-trained model and ML algorithms were combined and the results were obtained.</w:t>
+        <w:t xml:space="preserve">In phase 2, </w:t>
+      </w:r>
+      <w:r>
+        <w:rPr>
+          <w:rStyle w:val="jlqj4b"/>
+          <w:lang w:val="en-US"/>
+        </w:rPr>
+        <w:t xml:space="preserve">the deep features obtained from </w:t>
+      </w:r>
+      <w:r>
+        <w:rPr>
+          <w:rStyle w:val="jlqj4b"/>
+          <w:lang w:val="en-US"/>
+        </w:rPr>
+        <w:t xml:space="preserve">ResNet18 pre-trained model </w:t>
+      </w:r>
+      <w:r>
+        <w:rPr>
+          <w:rStyle w:val="jlqj4b"/>
+          <w:lang w:val="en-US"/>
+        </w:rPr>
+        <w:t>are used to train and test on</w:t>
+      </w:r>
+      <w:r>
+        <w:rPr>
+          <w:rStyle w:val="jlqj4b"/>
+          <w:lang w:val="en-US"/>
+        </w:rPr>
+        <w:t xml:space="preserve"> ML algorithms.</w:t>
       </w:r>
       <w:r>
         <w:rPr>
@@ -11256,49 +12098,56 @@
           <w:rFonts w:ascii="Times" w:hAnsi="Times"/>
           <w:lang w:val="en-US"/>
         </w:rPr>
-        <w:t xml:space="preserve">cross validation method was chosen and results were obtained </w:t>
+        <w:t>cross validation method was chosen and results were obtained</w:t>
+      </w:r>
+      <w:r>
+        <w:rPr>
+          <w:rFonts w:ascii="Times" w:hAnsi="Times"/>
+          <w:lang w:val="en-US"/>
+        </w:rPr>
+        <w:t xml:space="preserve">. The </w:t>
       </w:r>
       <w:r>
         <w:rPr>
           <w:rStyle w:val="jlqj4b"/>
           <w:lang w:val="en-US"/>
         </w:rPr>
-        <w:t>t</w:t>
+        <w:t xml:space="preserve">best results were obtained </w:t>
       </w:r>
       <w:r>
         <w:rPr>
           <w:rStyle w:val="jlqj4b"/>
           <w:lang w:val="en-US"/>
         </w:rPr>
-        <w:t>he best results for SVM, Logistic Regression and kNN users were obtained from SVM + CNN model with 95.29%.</w:t>
+        <w:t>with</w:t>
       </w:r>
       <w:r>
         <w:rPr>
           <w:rStyle w:val="jlqj4b"/>
           <w:lang w:val="en-US"/>
         </w:rPr>
-        <w:t xml:space="preserve"> It is considered that the results obtained are better than other results in the literature</w:t>
+        <w:t xml:space="preserve"> </w:t>
       </w:r>
       <w:r>
         <w:rPr>
           <w:rStyle w:val="jlqj4b"/>
           <w:lang w:val="en-US"/>
         </w:rPr>
-        <w:t xml:space="preserve"> and </w:t>
+        <w:t>Logistic Regression using deep features from ResNet18 pretrained</w:t>
       </w:r>
       <w:r>
         <w:rPr>
           <w:rStyle w:val="jlqj4b"/>
           <w:lang w:val="en-US"/>
         </w:rPr>
-        <w:t>a</w:t>
+        <w:t xml:space="preserve"> model </w:t>
       </w:r>
       <w:r>
         <w:rPr>
           <w:rStyle w:val="jlqj4b"/>
           <w:lang w:val="en-US"/>
         </w:rPr>
-        <w:t xml:space="preserve"> significant contribution is made to the literature for the diagnosis of Autism disease with the proposed structures.</w:t>
+        <w:t>as</w:t>
       </w:r>
       <w:r>
         <w:rPr>
@@ -11312,11 +12161,39 @@
           <w:rStyle w:val="jlqj4b"/>
           <w:lang w:val="en-US"/>
         </w:rPr>
-        <w:t>In future studies, the same brain MRI can be used to diagnose neural diseases such as schizophrenia, autism, and Alzheimer's.</w:t>
-      </w:r>
-      <w:r>
-        <w:rPr>
-          <w:rStyle w:val="viiyi"/>
+        <w:t>the accuracy of 96.05</w:t>
+      </w:r>
+      <w:r>
+        <w:rPr>
+          <w:rStyle w:val="jlqj4b"/>
+          <w:lang w:val="en-US"/>
+        </w:rPr>
+        <w:t>%</w:t>
+      </w:r>
+      <w:r>
+        <w:rPr>
+          <w:rStyle w:val="jlqj4b"/>
+          <w:lang w:val="en-US"/>
+        </w:rPr>
+        <w:t xml:space="preserve"> and the AUC score of </w:t>
+      </w:r>
+      <w:r>
+        <w:rPr>
+          <w:rStyle w:val="jlqj4b"/>
+          <w:lang w:val="en-US"/>
+        </w:rPr>
+        <w:t>0.9855</w:t>
+      </w:r>
+      <w:r>
+        <w:rPr>
+          <w:rStyle w:val="jlqj4b"/>
+          <w:lang w:val="en-US"/>
+        </w:rPr>
+        <w:t>.</w:t>
+      </w:r>
+      <w:r>
+        <w:rPr>
+          <w:rStyle w:val="jlqj4b"/>
           <w:lang w:val="en-US"/>
         </w:rPr>
         <w:t xml:space="preserve"> </w:t>
@@ -11326,7 +12203,23 @@
           <w:rStyle w:val="jlqj4b"/>
           <w:lang w:val="en-US"/>
         </w:rPr>
-        <w:t>This may be pave the way for the study to be conducted on animals as well.</w:t>
+        <w:t xml:space="preserve">For the reproducibility of results, the saved model weights of ResNet18 can be reached via </w:t>
+      </w:r>
+      <w:hyperlink r:id="rId57" w:history="1">
+        <w:r>
+          <w:rPr>
+            <w:rStyle w:val="Hyperlink"/>
+            <w:lang w:val="en-US"/>
+          </w:rPr>
+          <w:t>GitHub link</w:t>
+        </w:r>
+      </w:hyperlink>
+      <w:r>
+        <w:rPr>
+          <w:rStyle w:val="jlqj4b"/>
+          <w:lang w:val="en-US"/>
+        </w:rPr>
+        <w:t xml:space="preserve"> and machine learning experiments can be re-run with the seed of 17.</w:t>
       </w:r>
     </w:p>
     <w:p>
@@ -11334,7 +12227,7 @@
         <w:spacing w:line="276" w:lineRule="auto"/>
         <w:jc w:val="both"/>
         <w:rPr>
-          <w:rFonts w:ascii="Times" w:hAnsi="Times"/>
+          <w:rStyle w:val="jlqj4b"/>
           <w:lang w:val="en-US"/>
         </w:rPr>
       </w:pPr>
@@ -11344,30 +12237,72 @@
         <w:spacing w:line="276" w:lineRule="auto"/>
         <w:jc w:val="both"/>
         <w:rPr>
-          <w:rFonts w:ascii="Times" w:hAnsi="Times"/>
           <w:lang w:val="en-US"/>
         </w:rPr>
       </w:pPr>
-    </w:p>
-    <w:p>
-      <w:pPr>
-        <w:spacing w:line="276" w:lineRule="auto"/>
-        <w:jc w:val="both"/>
-        <w:rPr>
-          <w:rFonts w:ascii="Times" w:hAnsi="Times"/>
-          <w:lang w:val="en-US"/>
-        </w:rPr>
-      </w:pPr>
-    </w:p>
-    <w:p>
-      <w:pPr>
-        <w:spacing w:line="276" w:lineRule="auto"/>
-        <w:jc w:val="both"/>
-        <w:rPr>
-          <w:rFonts w:ascii="Times" w:hAnsi="Times"/>
-          <w:lang w:val="en-US"/>
-        </w:rPr>
-      </w:pPr>
+      <w:r>
+        <w:rPr>
+          <w:rStyle w:val="jlqj4b"/>
+          <w:lang w:val="en-US"/>
+        </w:rPr>
+        <w:t>Hereby, i</w:t>
+      </w:r>
+      <w:r>
+        <w:rPr>
+          <w:rStyle w:val="jlqj4b"/>
+          <w:lang w:val="en-US"/>
+        </w:rPr>
+        <w:t>t is considered that the results obtained are better than other results in the literature</w:t>
+      </w:r>
+      <w:r>
+        <w:rPr>
+          <w:rStyle w:val="jlqj4b"/>
+          <w:lang w:val="en-US"/>
+        </w:rPr>
+        <w:t xml:space="preserve"> and </w:t>
+      </w:r>
+      <w:r>
+        <w:rPr>
+          <w:rStyle w:val="jlqj4b"/>
+          <w:lang w:val="en-US"/>
+        </w:rPr>
+        <w:t>a</w:t>
+      </w:r>
+      <w:r>
+        <w:rPr>
+          <w:rStyle w:val="jlqj4b"/>
+          <w:lang w:val="en-US"/>
+        </w:rPr>
+        <w:t xml:space="preserve"> significant contribution is made to the literature for the diagnosis of Autism disease with the proposed structures.</w:t>
+      </w:r>
+      <w:r>
+        <w:rPr>
+          <w:rStyle w:val="jlqj4b"/>
+          <w:lang w:val="en-US"/>
+        </w:rPr>
+        <w:t xml:space="preserve"> </w:t>
+      </w:r>
+      <w:r>
+        <w:rPr>
+          <w:rStyle w:val="jlqj4b"/>
+          <w:lang w:val="en-US"/>
+        </w:rPr>
+        <w:t>In future studies, the same brain MRI can be used to diagnose neural diseases such as schizophrenia, autism, and Alzheimer's.</w:t>
+      </w:r>
+      <w:r>
+        <w:rPr>
+          <w:rStyle w:val="viiyi"/>
+          <w:lang w:val="en-US"/>
+        </w:rPr>
+        <w:t xml:space="preserve"> </w:t>
+      </w:r>
+      <w:r>
+        <w:rPr>
+          <w:rStyle w:val="jlqj4b"/>
+          <w:lang w:val="en-US"/>
+        </w:rPr>
+        <w:t>This may be pave the way for the study to be conducted on animals as well.</w:t>
+      </w:r>
     </w:p>
     <w:p>
       <w:pPr>
@@ -12175,64 +13110,71 @@
           <w:rFonts w:ascii="Times" w:hAnsi="Times"/>
           <w:lang w:val="en-US"/>
         </w:rPr>
+        <w:t>Nicha C</w:t>
+      </w:r>
+      <w:r>
+        <w:rPr>
+          <w:rFonts w:ascii="Times" w:hAnsi="Times"/>
+          <w:lang w:val="en-US"/>
+        </w:rPr>
+        <w:t>.</w:t>
+      </w:r>
+      <w:r>
+        <w:rPr>
+          <w:rFonts w:ascii="Times" w:hAnsi="Times"/>
+          <w:lang w:val="en-US"/>
+        </w:rPr>
+        <w:t xml:space="preserve"> Dvornek, Pamela Ventola, Kevin A</w:t>
+      </w:r>
+      <w:r>
+        <w:rPr>
+          <w:rFonts w:ascii="Times" w:hAnsi="Times"/>
+          <w:lang w:val="en-US"/>
+        </w:rPr>
+        <w:t>.</w:t>
+      </w:r>
+      <w:r>
+        <w:rPr>
+          <w:rFonts w:ascii="Times" w:hAnsi="Times"/>
+          <w:lang w:val="en-US"/>
+        </w:rPr>
+        <w:t xml:space="preserve"> Pelphrey, and James S</w:t>
+      </w:r>
+      <w:r>
+        <w:rPr>
+          <w:rFonts w:ascii="Times" w:hAnsi="Times"/>
+          <w:lang w:val="en-US"/>
+        </w:rPr>
+        <w:t>.</w:t>
+      </w:r>
+      <w:r>
+        <w:rPr>
+          <w:rFonts w:ascii="Times" w:hAnsi="Times"/>
+          <w:lang w:val="en-US"/>
+        </w:rPr>
+        <w:t xml:space="preserve"> Duncan. Identifying</w:t>
+      </w:r>
+      <w:r>
+        <w:rPr>
+          <w:rFonts w:ascii="Times" w:hAnsi="Times"/>
+          <w:lang w:val="en-US"/>
+        </w:rPr>
+        <w:t xml:space="preserve"> </w:t>
+      </w:r>
+      <w:r>
+        <w:rPr>
+          <w:rFonts w:ascii="Times" w:hAnsi="Times"/>
+          <w:lang w:val="en-US"/>
+        </w:rPr>
+        <w:t xml:space="preserve">autism from resting-state MRI using long short-term memory networks. In </w:t>
+      </w:r>
+      <w:r>
+        <w:rPr>
+          <w:rFonts w:ascii="Times" w:hAnsi="Times"/>
+          <w:lang w:val="en-US"/>
+        </w:rPr>
         <w:lastRenderedPageBreak/>
-        <w:t>Nicha C</w:t>
-      </w:r>
-      <w:r>
-        <w:rPr>
-          <w:rFonts w:ascii="Times" w:hAnsi="Times"/>
-          <w:lang w:val="en-US"/>
-        </w:rPr>
-        <w:t>.</w:t>
-      </w:r>
-      <w:r>
-        <w:rPr>
-          <w:rFonts w:ascii="Times" w:hAnsi="Times"/>
-          <w:lang w:val="en-US"/>
-        </w:rPr>
-        <w:t xml:space="preserve"> Dvornek, Pamela Ventola, Kevin A</w:t>
-      </w:r>
-      <w:r>
-        <w:rPr>
-          <w:rFonts w:ascii="Times" w:hAnsi="Times"/>
-          <w:lang w:val="en-US"/>
-        </w:rPr>
-        <w:t>.</w:t>
-      </w:r>
-      <w:r>
-        <w:rPr>
-          <w:rFonts w:ascii="Times" w:hAnsi="Times"/>
-          <w:lang w:val="en-US"/>
-        </w:rPr>
-        <w:t xml:space="preserve"> Pelphrey, and James S</w:t>
-      </w:r>
-      <w:r>
-        <w:rPr>
-          <w:rFonts w:ascii="Times" w:hAnsi="Times"/>
-          <w:lang w:val="en-US"/>
-        </w:rPr>
-        <w:t>.</w:t>
-      </w:r>
-      <w:r>
-        <w:rPr>
-          <w:rFonts w:ascii="Times" w:hAnsi="Times"/>
-          <w:lang w:val="en-US"/>
-        </w:rPr>
-        <w:t xml:space="preserve"> Duncan. Identifying</w:t>
-      </w:r>
-      <w:r>
-        <w:rPr>
-          <w:rFonts w:ascii="Times" w:hAnsi="Times"/>
-          <w:lang w:val="en-US"/>
-        </w:rPr>
-        <w:t xml:space="preserve"> </w:t>
-      </w:r>
-      <w:r>
-        <w:rPr>
-          <w:rFonts w:ascii="Times" w:hAnsi="Times"/>
-          <w:lang w:val="en-US"/>
-        </w:rPr>
-        <w:t>autism from resting-state MRI using long short-term memory networks. In International</w:t>
+        <w:t>International</w:t>
       </w:r>
       <w:r>
         <w:rPr>
@@ -12454,7 +13396,21 @@
           <w:rFonts w:ascii="Times" w:hAnsi="Times"/>
           <w:lang w:val="en-US"/>
         </w:rPr>
-        <w:t xml:space="preserve"> J Wol, Jed T Elison, Meghan R Swanson, Hongtu Zhu, Kelly N Botteron, et al. Early brain development in infants at high risk for autism spectrum disorder. Nature, 542(7641):348, 2017.</w:t>
+        <w:t xml:space="preserve"> J Wol, Jed T Elison, Meghan R Swanson, Hongtu Zhu, Kelly N Botteron, et al. Early brain development in infants at high risk for autism spectrum disorder. Nature, 542(7641):</w:t>
+      </w:r>
+      <w:r>
+        <w:rPr>
+          <w:rFonts w:ascii="Times" w:hAnsi="Times"/>
+          <w:lang w:val="en-US"/>
+        </w:rPr>
+        <w:t xml:space="preserve"> </w:t>
+      </w:r>
+      <w:r>
+        <w:rPr>
+          <w:rFonts w:ascii="Times" w:hAnsi="Times"/>
+          <w:lang w:val="en-US"/>
+        </w:rPr>
+        <w:t>348, 2017.</w:t>
       </w:r>
     </w:p>
     <w:p>
@@ -12559,37 +13515,10 @@
     </w:p>
     <w:p>
       <w:pPr>
-        <w:spacing w:line="276" w:lineRule="auto"/>
-        <w:jc w:val="both"/>
-        <w:rPr>
-          <w:rFonts w:ascii="Times" w:hAnsi="Times"/>
-          <w:lang w:val="en-US"/>
-        </w:rPr>
-      </w:pPr>
-    </w:p>
-    <w:p>
-      <w:pPr>
-        <w:spacing w:line="276" w:lineRule="auto"/>
-        <w:jc w:val="both"/>
-        <w:rPr>
-          <w:rFonts w:ascii="Times" w:hAnsi="Times"/>
-          <w:lang w:val="en-US"/>
-        </w:rPr>
-      </w:pPr>
-      <w:r>
-        <w:rPr>
-          <w:rFonts w:ascii="Times" w:hAnsi="Times"/>
-          <w:lang w:val="en-US"/>
-        </w:rPr>
-        <w:t>## TODO:</w:t>
-      </w:r>
-    </w:p>
-    <w:p>
-      <w:pPr>
         <w:pStyle w:val="ListParagraph"/>
         <w:numPr>
           <w:ilvl w:val="0"/>
-          <w:numId w:val="5"/>
+          <w:numId w:val="1"/>
         </w:numPr>
         <w:spacing w:line="276" w:lineRule="auto"/>
         <w:jc w:val="both"/>
@@ -12603,78 +13532,54 @@
           <w:rFonts w:ascii="Times" w:hAnsi="Times"/>
           <w:lang w:val="en-US"/>
         </w:rPr>
-        <w:t>Padam için referans eklenmeli</w:t>
-      </w:r>
-    </w:p>
-    <w:p>
-      <w:pPr>
-        <w:pStyle w:val="ListParagraph"/>
-        <w:numPr>
-          <w:ilvl w:val="0"/>
-          <w:numId w:val="5"/>
-        </w:numPr>
-        <w:spacing w:line="276" w:lineRule="auto"/>
-        <w:jc w:val="both"/>
-        <w:rPr>
-          <w:rFonts w:ascii="Times" w:hAnsi="Times"/>
-          <w:lang w:val="en-US"/>
-        </w:rPr>
-      </w:pPr>
-      <w:r>
-        <w:rPr>
-          <w:rFonts w:ascii="Times" w:hAnsi="Times"/>
-          <w:lang w:val="en-US"/>
-        </w:rPr>
-        <w:t>Optimizerlar için final momentum, partial, betas, weight decay değerleri</w:t>
-      </w:r>
-    </w:p>
-    <w:p>
-      <w:pPr>
-        <w:pStyle w:val="ListParagraph"/>
-        <w:numPr>
-          <w:ilvl w:val="1"/>
-          <w:numId w:val="5"/>
-        </w:numPr>
-        <w:spacing w:line="276" w:lineRule="auto"/>
-        <w:jc w:val="both"/>
-        <w:rPr>
-          <w:rFonts w:ascii="Times" w:hAnsi="Times"/>
-          <w:lang w:val="en-US"/>
-        </w:rPr>
-      </w:pPr>
-      <w:r>
-        <w:rPr>
-          <w:rFonts w:ascii="Times" w:hAnsi="Times"/>
-          <w:lang w:val="en-US"/>
-        </w:rPr>
-        <w:t>Gerekli mi?</w:t>
-      </w:r>
-    </w:p>
-    <w:p>
-      <w:pPr>
-        <w:pStyle w:val="ListParagraph"/>
-        <w:numPr>
-          <w:ilvl w:val="0"/>
-          <w:numId w:val="5"/>
-        </w:numPr>
-        <w:spacing w:line="276" w:lineRule="auto"/>
-        <w:jc w:val="both"/>
-        <w:rPr>
-          <w:rFonts w:ascii="Times" w:hAnsi="Times"/>
-          <w:lang w:val="en-US"/>
-        </w:rPr>
-      </w:pPr>
-      <w:r>
-        <w:rPr>
-          <w:rFonts w:ascii="Times" w:hAnsi="Times"/>
-          <w:lang w:val="en-US"/>
-        </w:rPr>
-        <w:t>ResNet18 %84.35 sonuç alınan pth dosyasının drive/github linki eklenmeli</w:t>
+        <w:t>Jinghui Chen, Quanquan Gu. Padam: Closing the Generalization Gap of Adaptive Gradient Methods in Training Deep Neural Networks</w:t>
+      </w:r>
+      <w:r>
+        <w:rPr>
+          <w:rFonts w:ascii="Times" w:hAnsi="Times"/>
+          <w:lang w:val="en-US"/>
+        </w:rPr>
+        <w:t>, pages 1-16,</w:t>
+      </w:r>
+      <w:r>
+        <w:rPr>
+          <w:rFonts w:ascii="Times" w:hAnsi="Times"/>
+          <w:lang w:val="en-US"/>
+        </w:rPr>
+        <w:t xml:space="preserve"> ICLR</w:t>
+      </w:r>
+      <w:r>
+        <w:rPr>
+          <w:rFonts w:ascii="Times" w:hAnsi="Times"/>
+          <w:lang w:val="en-US"/>
+        </w:rPr>
+        <w:t>,</w:t>
+      </w:r>
+      <w:r>
+        <w:rPr>
+          <w:rFonts w:ascii="Times" w:hAnsi="Times"/>
+          <w:lang w:val="en-US"/>
+        </w:rPr>
+        <w:t xml:space="preserve"> 2019</w:t>
+      </w:r>
+      <w:r>
+        <w:rPr>
+          <w:rFonts w:ascii="Times" w:hAnsi="Times"/>
+          <w:lang w:val="en-US"/>
+        </w:rPr>
+        <w:t>.</w:t>
+      </w:r>
+      <w:r>
+        <w:rPr>
+          <w:rFonts w:ascii="Times" w:hAnsi="Times"/>
+          <w:lang w:val="en-US"/>
+        </w:rPr>
+        <w:t xml:space="preserve"> </w:t>
       </w:r>
     </w:p>
     <w:sectPr>
       <w:pgSz w:w="11900" w:h="16840"/>
-      <w:pgMar w:top="1417" w:right="1417" w:bottom="1112" w:left="1417" w:header="708" w:footer="708" w:gutter="0"/>
+      <w:pgMar w:top="1417" w:right="1417" w:bottom="734" w:left="1417" w:header="708" w:footer="708" w:gutter="0"/>
       <w:cols w:space="708"/>
       <w:docGrid w:linePitch="360"/>
     </w:sectPr>
@@ -13588,7 +14493,6 @@
   <w:style w:type="character" w:default="1" w:styleId="DefaultParagraphFont">
     <w:name w:val="Default Paragraph Font"/>
     <w:uiPriority w:val="1"/>
-    <w:semiHidden/>
     <w:unhideWhenUsed/>
   </w:style>
   <w:style w:type="table" w:default="1" w:styleId="TableNormal">
@@ -18630,8 +19534,8 @@
       </dsp:nvSpPr>
       <dsp:spPr>
         <a:xfrm rot="16200000">
-          <a:off x="175260" y="-175260"/>
-          <a:ext cx="515937" cy="866457"/>
+          <a:off x="175137" y="-175137"/>
+          <a:ext cx="516193" cy="866468"/>
         </a:xfrm>
         <a:prstGeom prst="round1Rect">
           <a:avLst/>
@@ -18698,7 +19602,7 @@
       </dsp:txBody>
       <dsp:txXfrm rot="5400000">
         <a:off x="0" y="0"/>
-        <a:ext cx="866457" cy="386953"/>
+        <a:ext cx="866468" cy="387145"/>
       </dsp:txXfrm>
     </dsp:sp>
     <dsp:sp modelId="{922A1931-F829-AA49-B5A4-753850793CED}">
@@ -18708,8 +19612,8 @@
       </dsp:nvSpPr>
       <dsp:spPr>
         <a:xfrm>
-          <a:off x="866457" y="0"/>
-          <a:ext cx="866457" cy="515937"/>
+          <a:off x="866468" y="0"/>
+          <a:ext cx="866468" cy="516193"/>
         </a:xfrm>
         <a:prstGeom prst="round1Rect">
           <a:avLst/>
@@ -18775,8 +19679,8 @@
         </a:p>
       </dsp:txBody>
       <dsp:txXfrm>
-        <a:off x="866457" y="0"/>
-        <a:ext cx="866457" cy="386953"/>
+        <a:off x="866468" y="0"/>
+        <a:ext cx="866468" cy="387145"/>
       </dsp:txXfrm>
     </dsp:sp>
     <dsp:sp modelId="{8E24BDBB-8CDB-2F48-B962-4233FA39868B}">
@@ -18786,8 +19690,8 @@
       </dsp:nvSpPr>
       <dsp:spPr>
         <a:xfrm rot="10800000">
-          <a:off x="0" y="515937"/>
-          <a:ext cx="866457" cy="515937"/>
+          <a:off x="0" y="516193"/>
+          <a:ext cx="866468" cy="516193"/>
         </a:xfrm>
         <a:prstGeom prst="round1Rect">
           <a:avLst/>
@@ -18853,8 +19757,8 @@
         </a:p>
       </dsp:txBody>
       <dsp:txXfrm rot="10800000">
-        <a:off x="0" y="644921"/>
-        <a:ext cx="866457" cy="386953"/>
+        <a:off x="0" y="645241"/>
+        <a:ext cx="866468" cy="387145"/>
       </dsp:txXfrm>
     </dsp:sp>
     <dsp:sp modelId="{A677C8F4-3E21-FC48-A5FF-1B4B13644CC0}">
@@ -18864,8 +19768,8 @@
       </dsp:nvSpPr>
       <dsp:spPr>
         <a:xfrm rot="5400000">
-          <a:off x="1041717" y="340677"/>
-          <a:ext cx="515937" cy="866457"/>
+          <a:off x="1041605" y="341056"/>
+          <a:ext cx="516193" cy="866468"/>
         </a:xfrm>
         <a:prstGeom prst="round1Rect">
           <a:avLst/>
@@ -18931,8 +19835,8 @@
         </a:p>
       </dsp:txBody>
       <dsp:txXfrm rot="-5400000">
-        <a:off x="866457" y="644921"/>
-        <a:ext cx="866457" cy="386953"/>
+        <a:off x="866468" y="645241"/>
+        <a:ext cx="866468" cy="387145"/>
       </dsp:txXfrm>
     </dsp:sp>
     <dsp:sp modelId="{FAC6FD44-3154-F94D-BC43-C6DE3CFD3AF5}">
@@ -18942,8 +19846,8 @@
       </dsp:nvSpPr>
       <dsp:spPr>
         <a:xfrm>
-          <a:off x="606520" y="386953"/>
-          <a:ext cx="519874" cy="257968"/>
+          <a:off x="606527" y="387145"/>
+          <a:ext cx="519880" cy="258096"/>
         </a:xfrm>
         <a:prstGeom prst="roundRect">
           <a:avLst/>
@@ -19008,8 +19912,8 @@
         </a:p>
       </dsp:txBody>
       <dsp:txXfrm>
-        <a:off x="619113" y="399546"/>
-        <a:ext cx="494688" cy="232782"/>
+        <a:off x="619126" y="399744"/>
+        <a:ext cx="494682" cy="232898"/>
       </dsp:txXfrm>
     </dsp:sp>
   </dsp:spTree>

</xml_diff>

<commit_message>
code clean and final paper
</commit_message>
<xml_diff>
--- a/Interim_project_paper.docx
+++ b/Interim_project_paper.docx
@@ -2993,40 +2993,13 @@
         <w:t xml:space="preserve"> </w:t>
       </w:r>
       <w:r>
-        <w:t>Cross</w:t>
-      </w:r>
-      <w:r>
-        <w:t>-E</w:t>
-      </w:r>
-      <w:r>
-        <w:t xml:space="preserve">ntropy </w:t>
-      </w:r>
-      <w:r>
-        <w:t>L</w:t>
-      </w:r>
-      <w:r>
-        <w:t>oss</w:t>
+        <w:t>Cross-Entropy Loss</w:t>
       </w:r>
       <w:r>
         <w:t>,</w:t>
       </w:r>
       <w:r>
-        <w:t xml:space="preserve"> </w:t>
-      </w:r>
-      <w:r>
-        <w:t>which is</w:t>
-      </w:r>
-      <w:r>
-        <w:t xml:space="preserve"> the combination of Log SoftMax and Negative Log</w:t>
-      </w:r>
-      <w:r>
-        <w:t>-</w:t>
-      </w:r>
-      <w:r>
-        <w:t>Likelihood Loss</w:t>
-      </w:r>
-      <w:r>
-        <w:t xml:space="preserve"> functions</w:t>
+        <w:t xml:space="preserve"> which is the combination of Log SoftMax and Negative Log-Likelihood Loss functions</w:t>
       </w:r>
       <w:r>
         <w:t>,</w:t>
@@ -4158,19 +4131,7 @@
         <w:rPr>
           <w:rStyle w:val="jlqj4b"/>
         </w:rPr>
-        <w:t>separately</w:t>
-      </w:r>
-      <w:r>
-        <w:rPr>
-          <w:rStyle w:val="jlqj4b"/>
-        </w:rPr>
-        <w:t xml:space="preserve"> </w:t>
-      </w:r>
-      <w:r>
-        <w:rPr>
-          <w:rStyle w:val="jlqj4b"/>
-        </w:rPr>
-        <w:t xml:space="preserve">to optimize </w:t>
+        <w:t xml:space="preserve">separately to optimize </w:t>
       </w:r>
       <w:r>
         <w:rPr>
@@ -4239,8 +4200,8 @@
           <w:noProof/>
         </w:rPr>
         <w:drawing>
-          <wp:inline distT="0" distB="0" distL="0" distR="0" wp14:anchorId="3DE06203" wp14:editId="0B9FF335">
-            <wp:extent cx="5756910" cy="1279525"/>
+          <wp:inline distT="0" distB="0" distL="0" distR="0" wp14:anchorId="3DE06203" wp14:editId="7171E819">
+            <wp:extent cx="5503653" cy="1223236"/>
             <wp:effectExtent l="0" t="0" r="0" b="0"/>
             <wp:docPr id="48" name="Resim 48"/>
             <wp:cNvGraphicFramePr>
@@ -4268,7 +4229,7 @@
                   <pic:spPr>
                     <a:xfrm>
                       <a:off x="0" y="0"/>
-                      <a:ext cx="5756910" cy="1279525"/>
+                      <a:ext cx="5537210" cy="1230694"/>
                     </a:xfrm>
                     <a:prstGeom prst="rect">
                       <a:avLst/>
@@ -4340,15 +4301,6 @@
         </w:rPr>
         <w:t>.</w:t>
       </w:r>
-    </w:p>
-    <w:p>
-      <w:pPr>
-        <w:spacing w:line="276" w:lineRule="auto"/>
-        <w:jc w:val="both"/>
-        <w:rPr>
-          <w:rFonts w:ascii="Times" w:hAnsi="Times"/>
-        </w:rPr>
-      </w:pPr>
     </w:p>
     <w:p>
       <w:pPr>
@@ -4418,9 +4370,6 @@
       <w:pPr>
         <w:spacing w:line="276" w:lineRule="auto"/>
         <w:jc w:val="center"/>
-        <w:rPr>
-          <w:rStyle w:val="jlqj4b"/>
-        </w:rPr>
       </w:pPr>
       <w:r>
         <w:rPr>
@@ -4435,6 +4384,15 @@
       <w:r>
         <w:t>Resnet18 model</w:t>
       </w:r>
+    </w:p>
+    <w:p>
+      <w:pPr>
+        <w:spacing w:line="276" w:lineRule="auto"/>
+        <w:jc w:val="center"/>
+        <w:rPr>
+          <w:rStyle w:val="jlqj4b"/>
+        </w:rPr>
+      </w:pPr>
     </w:p>
     <w:p>
       <w:pPr>
@@ -4551,8 +4509,8 @@
           <w:szCs w:val="28"/>
         </w:rPr>
         <w:drawing>
-          <wp:inline distT="0" distB="0" distL="0" distR="0" wp14:anchorId="1FCD7694" wp14:editId="66FE9254">
-            <wp:extent cx="3237230" cy="3284008"/>
+          <wp:inline distT="0" distB="0" distL="0" distR="0" wp14:anchorId="1FCD7694" wp14:editId="4B4D7D47">
+            <wp:extent cx="3651250" cy="3416061"/>
             <wp:effectExtent l="0" t="0" r="0" b="0"/>
             <wp:docPr id="49" name="Resim 49"/>
             <wp:cNvGraphicFramePr>
@@ -4580,7 +4538,7 @@
                   <pic:spPr>
                     <a:xfrm>
                       <a:off x="0" y="0"/>
-                      <a:ext cx="3268104" cy="3315328"/>
+                      <a:ext cx="3694707" cy="3456719"/>
                     </a:xfrm>
                     <a:prstGeom prst="rect">
                       <a:avLst/>
@@ -4996,34 +4954,7 @@
         <w:jc w:val="both"/>
       </w:pPr>
       <w:r>
-        <w:t>Cross</w:t>
-      </w:r>
-      <w:r>
-        <w:t>-E</w:t>
-      </w:r>
-      <w:r>
-        <w:t>ntropy</w:t>
-      </w:r>
-      <w:r>
-        <w:t xml:space="preserve"> </w:t>
-      </w:r>
-      <w:r>
-        <w:t>as the combination of Log SoftMax and Negative Log</w:t>
-      </w:r>
-      <w:r>
-        <w:t>-</w:t>
-      </w:r>
-      <w:r>
-        <w:t>Likelihood Loss</w:t>
-      </w:r>
-      <w:r>
-        <w:t xml:space="preserve"> functions</w:t>
-      </w:r>
-      <w:r>
-        <w:t xml:space="preserve"> was </w:t>
-      </w:r>
-      <w:r>
-        <w:t>chosen to be the loss function</w:t>
+        <w:t>Cross-Entropy as the combination of Log SoftMax and Negative Log-Likelihood Loss functions was chosen to be the loss function</w:t>
       </w:r>
       <w:r>
         <w:t xml:space="preserve"> as </w:t>
@@ -5586,7 +5517,6 @@
         <w:rPr>
           <w:rFonts w:ascii="Cambria Math" w:hAnsi="Cambria Math"/>
           <w:iCs/>
-          <w:lang w:val="en-TR"/>
         </w:rPr>
       </w:pPr>
       <m:oMath>
@@ -5595,18 +5525,8 @@
             <w:rFonts w:ascii="Cambria Math" w:hAnsi="Cambria Math"/>
             <w:sz w:val="18"/>
             <w:szCs w:val="18"/>
-            <w:lang w:val="en-TR"/>
           </w:rPr>
-          <m:t xml:space="preserve">    </m:t>
-        </m:r>
-        <m:r>
-          <w:rPr>
-            <w:rFonts w:ascii="Cambria Math" w:hAnsi="Cambria Math"/>
-            <w:sz w:val="18"/>
-            <w:szCs w:val="18"/>
-            <w:lang w:val="en-TR"/>
-          </w:rPr>
-          <m:t>LogSoftmax(</m:t>
+          <m:t xml:space="preserve">    LogSoftmax(</m:t>
         </m:r>
         <m:sSub>
           <m:sSubPr>
@@ -5617,7 +5537,6 @@
                 <w:iCs/>
                 <w:sz w:val="18"/>
                 <w:szCs w:val="18"/>
-                <w:lang w:val="en-TR"/>
               </w:rPr>
             </m:ctrlPr>
           </m:sSubPr>
@@ -5627,7 +5546,6 @@
                 <w:rFonts w:ascii="Cambria Math" w:hAnsi="Cambria Math"/>
                 <w:sz w:val="18"/>
                 <w:szCs w:val="18"/>
-                <w:lang w:val="en-TR"/>
               </w:rPr>
               <m:t>x</m:t>
             </m:r>
@@ -5637,7 +5555,6 @@
                 <w:i/>
                 <w:sz w:val="18"/>
                 <w:szCs w:val="18"/>
-                <w:lang w:val="en-TR"/>
               </w:rPr>
             </m:ctrlPr>
           </m:e>
@@ -5647,7 +5564,6 @@
                 <w:rFonts w:ascii="Cambria Math" w:hAnsi="Cambria Math"/>
                 <w:sz w:val="18"/>
                 <w:szCs w:val="18"/>
-                <w:lang w:val="en-TR"/>
               </w:rPr>
               <m:t>i</m:t>
             </m:r>
@@ -5658,7 +5574,6 @@
             <w:rFonts w:ascii="Cambria Math" w:hAnsi="Cambria Math"/>
             <w:sz w:val="18"/>
             <w:szCs w:val="18"/>
-            <w:lang w:val="en-TR"/>
           </w:rPr>
           <m:t>)=log(</m:t>
         </m:r>
@@ -5670,7 +5585,6 @@
                 <w:i/>
                 <w:sz w:val="18"/>
                 <w:szCs w:val="18"/>
-                <w:lang w:val="en-TR"/>
               </w:rPr>
             </m:ctrlPr>
           </m:fPr>
@@ -5680,7 +5594,6 @@
                 <w:rFonts w:ascii="Cambria Math" w:hAnsi="Cambria Math"/>
                 <w:sz w:val="18"/>
                 <w:szCs w:val="18"/>
-                <w:lang w:val="en-TR"/>
               </w:rPr>
               <m:t>exp(</m:t>
             </m:r>
@@ -5693,7 +5606,6 @@
                     <w:iCs/>
                     <w:sz w:val="18"/>
                     <w:szCs w:val="18"/>
-                    <w:lang w:val="en-TR"/>
                   </w:rPr>
                 </m:ctrlPr>
               </m:sSubPr>
@@ -5703,7 +5615,6 @@
                     <w:rFonts w:ascii="Cambria Math" w:hAnsi="Cambria Math"/>
                     <w:sz w:val="18"/>
                     <w:szCs w:val="18"/>
-                    <w:lang w:val="en-TR"/>
                   </w:rPr>
                   <m:t>x</m:t>
                 </m:r>
@@ -5713,7 +5624,6 @@
                     <w:i/>
                     <w:sz w:val="18"/>
                     <w:szCs w:val="18"/>
-                    <w:lang w:val="en-TR"/>
                   </w:rPr>
                 </m:ctrlPr>
               </m:e>
@@ -5723,7 +5633,6 @@
                     <w:rFonts w:ascii="Cambria Math" w:hAnsi="Cambria Math"/>
                     <w:sz w:val="18"/>
                     <w:szCs w:val="18"/>
-                    <w:lang w:val="en-TR"/>
                   </w:rPr>
                   <m:t>i</m:t>
                 </m:r>
@@ -5734,7 +5643,6 @@
                 <w:rFonts w:ascii="Cambria Math" w:hAnsi="Cambria Math"/>
                 <w:sz w:val="18"/>
                 <w:szCs w:val="18"/>
-                <w:lang w:val="en-TR"/>
               </w:rPr>
               <m:t>​)</m:t>
             </m:r>
@@ -5751,7 +5659,6 @@
                     <w:i/>
                     <w:sz w:val="18"/>
                     <w:szCs w:val="18"/>
-                    <w:lang w:val="en-TR"/>
                   </w:rPr>
                 </m:ctrlPr>
               </m:naryPr>
@@ -5761,7 +5668,6 @@
                     <w:rFonts w:ascii="Cambria Math" w:hAnsi="Cambria Math"/>
                     <w:sz w:val="18"/>
                     <w:szCs w:val="18"/>
-                    <w:lang w:val="en-TR"/>
                   </w:rPr>
                   <m:t>j</m:t>
                 </m:r>
@@ -5776,7 +5682,6 @@
                     <w:rFonts w:ascii="Cambria Math" w:hAnsi="Cambria Math"/>
                     <w:sz w:val="18"/>
                     <w:szCs w:val="18"/>
-                    <w:lang w:val="en-TR"/>
                   </w:rPr>
                   <m:t>exp⁡</m:t>
                 </m:r>
@@ -5785,7 +5690,6 @@
                     <w:rFonts w:ascii="Cambria Math" w:hAnsi="Cambria Math"/>
                     <w:sz w:val="18"/>
                     <w:szCs w:val="18"/>
-                    <w:lang w:val="en-TR"/>
                   </w:rPr>
                   <m:t>(</m:t>
                 </m:r>
@@ -5797,7 +5701,6 @@
                         <w:i/>
                         <w:sz w:val="18"/>
                         <w:szCs w:val="18"/>
-                        <w:lang w:val="en-TR"/>
                       </w:rPr>
                     </m:ctrlPr>
                   </m:sSubPr>
@@ -5807,7 +5710,6 @@
                         <w:rFonts w:ascii="Cambria Math" w:hAnsi="Cambria Math"/>
                         <w:sz w:val="18"/>
                         <w:szCs w:val="18"/>
-                        <w:lang w:val="en-TR"/>
                       </w:rPr>
                       <m:t>x</m:t>
                     </m:r>
@@ -5818,7 +5720,6 @@
                         <w:rFonts w:ascii="Cambria Math" w:hAnsi="Cambria Math"/>
                         <w:sz w:val="18"/>
                         <w:szCs w:val="18"/>
-                        <w:lang w:val="en-TR"/>
                       </w:rPr>
                       <m:t>j</m:t>
                     </m:r>
@@ -5829,7 +5730,6 @@
                     <w:rFonts w:ascii="Cambria Math" w:hAnsi="Cambria Math"/>
                     <w:sz w:val="18"/>
                     <w:szCs w:val="18"/>
-                    <w:lang w:val="en-TR"/>
                   </w:rPr>
                   <m:t>)</m:t>
                 </m:r>
@@ -5842,27 +5742,8 @@
             <w:rFonts w:ascii="Cambria Math" w:hAnsi="Cambria Math"/>
             <w:sz w:val="18"/>
             <w:szCs w:val="18"/>
-            <w:lang w:val="en-TR"/>
           </w:rPr>
-          <m:t>​</m:t>
-        </m:r>
-        <m:r>
-          <w:rPr>
-            <w:rFonts w:ascii="Cambria Math" w:hAnsi="Cambria Math"/>
-            <w:sz w:val="18"/>
-            <w:szCs w:val="18"/>
-            <w:lang w:val="en-TR"/>
-          </w:rPr>
-          <m:t>)</m:t>
-        </m:r>
-        <m:r>
-          <w:rPr>
-            <w:rFonts w:ascii="Cambria Math" w:hAnsi="Cambria Math"/>
-            <w:sz w:val="18"/>
-            <w:szCs w:val="18"/>
-            <w:lang w:val="en-TR"/>
-          </w:rPr>
-          <m:t xml:space="preserve"> </m:t>
+          <m:t xml:space="preserve">​) </m:t>
         </m:r>
       </m:oMath>
       <w:r>
@@ -5899,7 +5780,6 @@
             <w:rFonts w:ascii="Cambria Math" w:hAnsi="Cambria Math"/>
             <w:sz w:val="18"/>
             <w:szCs w:val="18"/>
-            <w:lang w:val="en-TR"/>
           </w:rPr>
           <m:t>loss</m:t>
         </m:r>
@@ -5912,7 +5792,6 @@
                 <w:iCs/>
                 <w:sz w:val="18"/>
                 <w:szCs w:val="18"/>
-                <w:lang w:val="en-TR"/>
               </w:rPr>
             </m:ctrlPr>
           </m:dPr>
@@ -5922,7 +5801,6 @@
                 <w:rFonts w:ascii="Cambria Math" w:hAnsi="Cambria Math"/>
                 <w:sz w:val="18"/>
                 <w:szCs w:val="18"/>
-                <w:lang w:val="en-TR"/>
               </w:rPr>
               <m:t>x, class</m:t>
             </m:r>
@@ -5933,7 +5811,6 @@
             <w:rFonts w:ascii="Cambria Math" w:hAnsi="Cambria Math"/>
             <w:sz w:val="18"/>
             <w:szCs w:val="18"/>
-            <w:lang w:val="en-TR"/>
           </w:rPr>
           <m:t>= -</m:t>
         </m:r>
@@ -5945,7 +5822,6 @@
             <w:rFonts w:ascii="Cambria Math" w:hAnsi="Cambria Math"/>
             <w:sz w:val="18"/>
             <w:szCs w:val="18"/>
-            <w:lang w:val="en-TR"/>
           </w:rPr>
           <m:t>log⁡</m:t>
         </m:r>
@@ -5954,7 +5830,6 @@
             <w:rFonts w:ascii="Cambria Math" w:hAnsi="Cambria Math"/>
             <w:sz w:val="18"/>
             <w:szCs w:val="18"/>
-            <w:lang w:val="en-TR"/>
           </w:rPr>
           <m:t>(</m:t>
         </m:r>
@@ -5967,7 +5842,6 @@
                 <w:iCs/>
                 <w:sz w:val="18"/>
                 <w:szCs w:val="18"/>
-                <w:lang w:val="en-TR"/>
               </w:rPr>
             </m:ctrlPr>
           </m:fPr>
@@ -5980,7 +5854,6 @@
                 <w:rFonts w:ascii="Cambria Math" w:hAnsi="Cambria Math"/>
                 <w:sz w:val="18"/>
                 <w:szCs w:val="18"/>
-                <w:lang w:val="en-TR"/>
               </w:rPr>
               <m:t>exp⁡</m:t>
             </m:r>
@@ -5989,7 +5862,6 @@
                 <w:rFonts w:ascii="Cambria Math" w:hAnsi="Cambria Math"/>
                 <w:sz w:val="18"/>
                 <w:szCs w:val="18"/>
-                <w:lang w:val="en-TR"/>
               </w:rPr>
               <m:t>(x[class])</m:t>
             </m:r>
@@ -6007,7 +5879,6 @@
                     <w:iCs/>
                     <w:sz w:val="18"/>
                     <w:szCs w:val="18"/>
-                    <w:lang w:val="en-TR"/>
                   </w:rPr>
                 </m:ctrlPr>
               </m:naryPr>
@@ -6017,7 +5888,6 @@
                     <w:rFonts w:ascii="Cambria Math" w:hAnsi="Cambria Math"/>
                     <w:sz w:val="18"/>
                     <w:szCs w:val="18"/>
-                    <w:lang w:val="en-TR"/>
                   </w:rPr>
                   <m:t>j</m:t>
                 </m:r>
@@ -6032,7 +5902,6 @@
                     <w:rFonts w:ascii="Cambria Math" w:hAnsi="Cambria Math"/>
                     <w:sz w:val="18"/>
                     <w:szCs w:val="18"/>
-                    <w:lang w:val="en-TR"/>
                   </w:rPr>
                   <m:t>exp⁡</m:t>
                 </m:r>
@@ -6041,7 +5910,6 @@
                     <w:rFonts w:ascii="Cambria Math" w:hAnsi="Cambria Math"/>
                     <w:sz w:val="18"/>
                     <w:szCs w:val="18"/>
-                    <w:lang w:val="en-TR"/>
                   </w:rPr>
                   <m:t>(x[j])</m:t>
                 </m:r>
@@ -6054,7 +5922,6 @@
             <w:rFonts w:ascii="Cambria Math" w:hAnsi="Cambria Math"/>
             <w:sz w:val="18"/>
             <w:szCs w:val="18"/>
-            <w:lang w:val="en-TR"/>
           </w:rPr>
           <m:t>)</m:t>
         </m:r>
@@ -6069,7 +5936,6 @@
           <w:bCs/>
           <w:sz w:val="18"/>
           <w:szCs w:val="18"/>
-          <w:lang w:val="en-TR"/>
         </w:rPr>
       </w:pPr>
       <m:oMathPara>
@@ -6082,18 +5948,8 @@
               <w:rFonts w:ascii="Cambria Math" w:hAnsi="Cambria Math"/>
               <w:sz w:val="18"/>
               <w:szCs w:val="18"/>
-              <w:lang w:val="en-TR"/>
             </w:rPr>
-            <m:t xml:space="preserve">   </m:t>
-          </m:r>
-          <m:r>
-            <w:rPr>
-              <w:rFonts w:ascii="Cambria Math" w:hAnsi="Cambria Math"/>
-              <w:sz w:val="18"/>
-              <w:szCs w:val="18"/>
-              <w:lang w:val="en-TR"/>
-            </w:rPr>
-            <m:t>NLLLoss</m:t>
+            <m:t xml:space="preserve">   NLLLoss</m:t>
           </m:r>
           <m:d>
             <m:dPr>
@@ -6103,7 +5959,6 @@
                   <w:i/>
                   <w:sz w:val="18"/>
                   <w:szCs w:val="18"/>
-                  <w:lang w:val="en-TR"/>
                 </w:rPr>
               </m:ctrlPr>
             </m:dPr>
@@ -6113,27 +5968,8 @@
                   <w:rFonts w:ascii="Cambria Math" w:hAnsi="Cambria Math"/>
                   <w:sz w:val="18"/>
                   <w:szCs w:val="18"/>
-                  <w:lang w:val="en-TR"/>
                 </w:rPr>
-                <m:t>x</m:t>
-              </m:r>
-              <m:r>
-                <w:rPr>
-                  <w:rFonts w:ascii="Cambria Math" w:hAnsi="Cambria Math"/>
-                  <w:sz w:val="18"/>
-                  <w:szCs w:val="18"/>
-                  <w:lang w:val="en-TR"/>
-                </w:rPr>
-                <m:t>,</m:t>
-              </m:r>
-              <m:r>
-                <w:rPr>
-                  <w:rFonts w:ascii="Cambria Math" w:hAnsi="Cambria Math"/>
-                  <w:sz w:val="18"/>
-                  <w:szCs w:val="18"/>
-                  <w:lang w:val="en-TR"/>
-                </w:rPr>
-                <m:t>y</m:t>
+                <m:t>x,y</m:t>
               </m:r>
             </m:e>
           </m:d>
@@ -6142,7 +5978,6 @@
               <w:rFonts w:ascii="Cambria Math" w:hAnsi="Cambria Math"/>
               <w:sz w:val="18"/>
               <w:szCs w:val="18"/>
-              <w:lang w:val="en-TR"/>
             </w:rPr>
             <m:t>=</m:t>
           </m:r>
@@ -6156,7 +5991,6 @@
                   <w:i/>
                   <w:sz w:val="18"/>
                   <w:szCs w:val="18"/>
-                  <w:lang w:val="en-TR"/>
                 </w:rPr>
               </m:ctrlPr>
             </m:naryPr>
@@ -6166,7 +6000,6 @@
                   <w:rFonts w:ascii="Cambria Math" w:hAnsi="Cambria Math"/>
                   <w:sz w:val="18"/>
                   <w:szCs w:val="18"/>
-                  <w:lang w:val="en-TR"/>
                 </w:rPr>
                 <m:t>n=1</m:t>
               </m:r>
@@ -6177,7 +6010,6 @@
                   <w:rFonts w:ascii="Cambria Math" w:hAnsi="Cambria Math"/>
                   <w:sz w:val="18"/>
                   <w:szCs w:val="18"/>
-                  <w:lang w:val="en-TR"/>
                 </w:rPr>
                 <m:t>N</m:t>
               </m:r>
@@ -6192,7 +6024,6 @@
                       <w:i/>
                       <w:sz w:val="18"/>
                       <w:szCs w:val="18"/>
-                      <w:lang w:val="en-TR"/>
                     </w:rPr>
                   </m:ctrlPr>
                 </m:fPr>
@@ -6205,7 +6036,6 @@
                           <w:i/>
                           <w:sz w:val="18"/>
                           <w:szCs w:val="18"/>
-                          <w:lang w:val="en-TR"/>
                         </w:rPr>
                       </m:ctrlPr>
                     </m:sSubPr>
@@ -6215,7 +6045,6 @@
                           <w:rFonts w:ascii="Cambria Math" w:hAnsi="Cambria Math"/>
                           <w:sz w:val="18"/>
                           <w:szCs w:val="18"/>
-                          <w:lang w:val="en-TR"/>
                         </w:rPr>
                         <m:t>l</m:t>
                       </m:r>
@@ -6226,7 +6055,6 @@
                           <w:rFonts w:ascii="Cambria Math" w:hAnsi="Cambria Math"/>
                           <w:sz w:val="18"/>
                           <w:szCs w:val="18"/>
-                          <w:lang w:val="en-TR"/>
                         </w:rPr>
                         <m:t>n</m:t>
                       </m:r>
@@ -6244,7 +6072,6 @@
                           <w:i/>
                           <w:sz w:val="18"/>
                           <w:szCs w:val="18"/>
-                          <w:lang w:val="en-TR"/>
                         </w:rPr>
                       </m:ctrlPr>
                     </m:naryPr>
@@ -6254,7 +6081,6 @@
                           <w:rFonts w:ascii="Cambria Math" w:hAnsi="Cambria Math"/>
                           <w:sz w:val="18"/>
                           <w:szCs w:val="18"/>
-                          <w:lang w:val="en-TR"/>
                         </w:rPr>
                         <m:t>n=1</m:t>
                       </m:r>
@@ -6265,7 +6091,6 @@
                           <w:rFonts w:ascii="Cambria Math" w:hAnsi="Cambria Math"/>
                           <w:sz w:val="18"/>
                           <w:szCs w:val="18"/>
-                          <w:lang w:val="en-TR"/>
                         </w:rPr>
                         <m:t>N</m:t>
                       </m:r>
@@ -6279,7 +6104,6 @@
                               <w:i/>
                               <w:sz w:val="18"/>
                               <w:szCs w:val="18"/>
-                              <w:lang w:val="en-TR"/>
                             </w:rPr>
                           </m:ctrlPr>
                         </m:sSubPr>
@@ -6289,7 +6113,6 @@
                               <w:rFonts w:ascii="Cambria Math" w:hAnsi="Cambria Math"/>
                               <w:sz w:val="18"/>
                               <w:szCs w:val="18"/>
-                              <w:lang w:val="en-TR"/>
                             </w:rPr>
                             <m:t>w</m:t>
                           </m:r>
@@ -6303,7 +6126,6 @@
                                   <w:i/>
                                   <w:sz w:val="18"/>
                                   <w:szCs w:val="18"/>
-                                  <w:lang w:val="en-TR"/>
                                 </w:rPr>
                               </m:ctrlPr>
                             </m:sSubPr>
@@ -6313,7 +6135,6 @@
                                   <w:rFonts w:ascii="Cambria Math" w:hAnsi="Cambria Math"/>
                                   <w:sz w:val="18"/>
                                   <w:szCs w:val="18"/>
-                                  <w:lang w:val="en-TR"/>
                                 </w:rPr>
                                 <m:t>y</m:t>
                               </m:r>
@@ -6324,7 +6145,6 @@
                                   <w:rFonts w:ascii="Cambria Math" w:hAnsi="Cambria Math"/>
                                   <w:sz w:val="18"/>
                                   <w:szCs w:val="18"/>
-                                  <w:lang w:val="en-TR"/>
                                 </w:rPr>
                                 <m:t>n</m:t>
                               </m:r>
@@ -6343,7 +6163,6 @@
               <w:rFonts w:ascii="Cambria Math" w:hAnsi="Cambria Math"/>
               <w:sz w:val="18"/>
               <w:szCs w:val="18"/>
-              <w:lang w:val="en-TR"/>
             </w:rPr>
             <m:t xml:space="preserve">; </m:t>
           </m:r>
@@ -6355,7 +6174,6 @@
                   <w:i/>
                   <w:sz w:val="18"/>
                   <w:szCs w:val="18"/>
-                  <w:lang w:val="en-TR"/>
                 </w:rPr>
               </m:ctrlPr>
             </m:sSubPr>
@@ -6365,7 +6183,6 @@
                   <w:rFonts w:ascii="Cambria Math" w:hAnsi="Cambria Math"/>
                   <w:sz w:val="18"/>
                   <w:szCs w:val="18"/>
-                  <w:lang w:val="en-TR"/>
                 </w:rPr>
                 <m:t>l</m:t>
               </m:r>
@@ -6376,7 +6193,6 @@
                   <w:rFonts w:ascii="Cambria Math" w:hAnsi="Cambria Math"/>
                   <w:sz w:val="18"/>
                   <w:szCs w:val="18"/>
-                  <w:lang w:val="en-TR"/>
                 </w:rPr>
                 <m:t>n</m:t>
               </m:r>
@@ -6387,7 +6203,6 @@
               <w:rFonts w:ascii="Cambria Math" w:hAnsi="Cambria Math"/>
               <w:sz w:val="18"/>
               <w:szCs w:val="18"/>
-              <w:lang w:val="en-TR"/>
             </w:rPr>
             <m:t>= -</m:t>
           </m:r>
@@ -6399,7 +6214,6 @@
                   <w:i/>
                   <w:sz w:val="18"/>
                   <w:szCs w:val="18"/>
-                  <w:lang w:val="en-TR"/>
                 </w:rPr>
               </m:ctrlPr>
             </m:sSubPr>
@@ -6409,7 +6223,6 @@
                   <w:rFonts w:ascii="Cambria Math" w:hAnsi="Cambria Math"/>
                   <w:sz w:val="18"/>
                   <w:szCs w:val="18"/>
-                  <w:lang w:val="en-TR"/>
                 </w:rPr>
                 <m:t>w</m:t>
               </m:r>
@@ -6423,7 +6236,6 @@
                       <w:i/>
                       <w:sz w:val="18"/>
                       <w:szCs w:val="18"/>
-                      <w:lang w:val="en-TR"/>
                     </w:rPr>
                   </m:ctrlPr>
                 </m:sSubPr>
@@ -6433,7 +6245,6 @@
                       <w:rFonts w:ascii="Cambria Math" w:hAnsi="Cambria Math"/>
                       <w:sz w:val="18"/>
                       <w:szCs w:val="18"/>
-                      <w:lang w:val="en-TR"/>
                     </w:rPr>
                     <m:t>y</m:t>
                   </m:r>
@@ -6444,7 +6255,6 @@
                       <w:rFonts w:ascii="Cambria Math" w:hAnsi="Cambria Math"/>
                       <w:sz w:val="18"/>
                       <w:szCs w:val="18"/>
-                      <w:lang w:val="en-TR"/>
                     </w:rPr>
                     <m:t>n</m:t>
                   </m:r>
@@ -6460,7 +6270,6 @@
                   <w:i/>
                   <w:sz w:val="18"/>
                   <w:szCs w:val="18"/>
-                  <w:lang w:val="en-TR"/>
                 </w:rPr>
               </m:ctrlPr>
             </m:sSubPr>
@@ -6470,7 +6279,6 @@
                   <w:rFonts w:ascii="Cambria Math" w:hAnsi="Cambria Math"/>
                   <w:sz w:val="18"/>
                   <w:szCs w:val="18"/>
-                  <w:lang w:val="en-TR"/>
                 </w:rPr>
                 <m:t>x</m:t>
               </m:r>
@@ -6481,7 +6289,6 @@
                   <w:rFonts w:ascii="Cambria Math" w:hAnsi="Cambria Math"/>
                   <w:sz w:val="18"/>
                   <w:szCs w:val="18"/>
-                  <w:lang w:val="en-TR"/>
                 </w:rPr>
                 <m:t xml:space="preserve">n, </m:t>
               </m:r>
@@ -6493,7 +6300,6 @@
                       <w:i/>
                       <w:sz w:val="18"/>
                       <w:szCs w:val="18"/>
-                      <w:lang w:val="en-TR"/>
                     </w:rPr>
                   </m:ctrlPr>
                 </m:sSubPr>
@@ -6503,7 +6309,6 @@
                       <w:rFonts w:ascii="Cambria Math" w:hAnsi="Cambria Math"/>
                       <w:sz w:val="18"/>
                       <w:szCs w:val="18"/>
-                      <w:lang w:val="en-TR"/>
                     </w:rPr>
                     <m:t>y</m:t>
                   </m:r>
@@ -6514,7 +6319,6 @@
                       <w:rFonts w:ascii="Cambria Math" w:hAnsi="Cambria Math"/>
                       <w:sz w:val="18"/>
                       <w:szCs w:val="18"/>
-                      <w:lang w:val="en-TR"/>
                     </w:rPr>
                     <m:t>n</m:t>
                   </m:r>
@@ -6527,7 +6331,6 @@
               <w:rFonts w:ascii="Cambria Math" w:hAnsi="Cambria Math"/>
               <w:sz w:val="18"/>
               <w:szCs w:val="18"/>
-              <w:lang w:val="en-TR"/>
             </w:rPr>
             <m:t xml:space="preserve"> ; </m:t>
           </m:r>
@@ -6539,7 +6342,6 @@
                   <w:i/>
                   <w:sz w:val="18"/>
                   <w:szCs w:val="18"/>
-                  <w:lang w:val="en-TR"/>
                 </w:rPr>
               </m:ctrlPr>
             </m:sSubPr>
@@ -6549,7 +6351,6 @@
                   <w:rFonts w:ascii="Cambria Math" w:hAnsi="Cambria Math"/>
                   <w:sz w:val="18"/>
                   <w:szCs w:val="18"/>
-                  <w:lang w:val="en-TR"/>
                 </w:rPr>
                 <m:t>w</m:t>
               </m:r>
@@ -6560,7 +6361,6 @@
                   <w:rFonts w:ascii="Cambria Math" w:hAnsi="Cambria Math"/>
                   <w:sz w:val="18"/>
                   <w:szCs w:val="18"/>
-                  <w:lang w:val="en-TR"/>
                 </w:rPr>
                 <m:t>c</m:t>
               </m:r>
@@ -6571,7 +6371,6 @@
               <w:rFonts w:ascii="Cambria Math" w:hAnsi="Cambria Math"/>
               <w:sz w:val="18"/>
               <w:szCs w:val="18"/>
-              <w:lang w:val="en-TR"/>
             </w:rPr>
             <m:t>=weight</m:t>
           </m:r>
@@ -6585,7 +6384,6 @@
                   <w:i/>
                   <w:sz w:val="18"/>
                   <w:szCs w:val="18"/>
-                  <w:lang w:val="en-TR"/>
                 </w:rPr>
               </m:ctrlPr>
             </m:dPr>
@@ -6595,7 +6393,6 @@
                   <w:rFonts w:ascii="Cambria Math" w:hAnsi="Cambria Math"/>
                   <w:sz w:val="18"/>
                   <w:szCs w:val="18"/>
-                  <w:lang w:val="en-TR"/>
                 </w:rPr>
                 <m:t>c</m:t>
               </m:r>
@@ -6606,7 +6403,6 @@
               <w:rFonts w:ascii="Cambria Math" w:hAnsi="Cambria Math"/>
               <w:sz w:val="18"/>
               <w:szCs w:val="18"/>
-              <w:lang w:val="en-TR"/>
             </w:rPr>
             <m:t xml:space="preserve">. </m:t>
           </m:r>
@@ -6618,7 +6414,6 @@
               <w:rFonts w:ascii="Cambria Math" w:hAnsi="Cambria Math"/>
               <w:sz w:val="18"/>
               <w:szCs w:val="18"/>
-              <w:lang w:val="en-TR"/>
             </w:rPr>
             <m:t>1</m:t>
           </m:r>
@@ -6629,9 +6424,6 @@
       <w:pPr>
         <w:spacing w:line="480" w:lineRule="auto"/>
         <w:jc w:val="center"/>
-        <w:rPr>
-          <w:lang w:val="tr-TR"/>
-        </w:rPr>
       </w:pPr>
       <w:r>
         <w:rPr>
@@ -6959,6 +6751,47 @@
       <w:r>
         <w:t xml:space="preserve">. </w:t>
       </w:r>
+      <w:r>
+        <w:t xml:space="preserve">RBF (Radial Basis Function) kernel function </w:t>
+      </w:r>
+      <w:r>
+        <w:t>was</w:t>
+      </w:r>
+      <w:r>
+        <w:t xml:space="preserve"> used in the </w:t>
+      </w:r>
+      <w:r>
+        <w:t xml:space="preserve">SVM </w:t>
+      </w:r>
+      <w:r>
+        <w:t>classification</w:t>
+      </w:r>
+      <w:r>
+        <w:t xml:space="preserve">. In LR model, </w:t>
+      </w:r>
+      <w:r>
+        <w:t xml:space="preserve">L-BSFG (Limited Memory </w:t>
+      </w:r>
+      <w:r>
+        <w:t>Broyden–Fletcher–Goldfarb–Shanno</w:t>
+      </w:r>
+      <w:r>
+        <w:t xml:space="preserve">) solver was chosen. For kNN, </w:t>
+      </w:r>
+      <w:proofErr w:type="spellStart"/>
+      <w:r>
+        <w:t>Minkowski</w:t>
+      </w:r>
+      <w:proofErr w:type="spellEnd"/>
+      <w:r>
+        <w:t xml:space="preserve"> metric was used with Euclidean distance, and algorithm choice was left to the used library to auto decide one in (“Ball Tree”, “K-Dimensional Tree”, “Brute-Force”) </w:t>
+      </w:r>
+      <w:r>
+        <w:t>based on the values passed</w:t>
+      </w:r>
+      <w:r>
+        <w:t>.</w:t>
+      </w:r>
     </w:p>
     <w:p>
       <w:pPr>
@@ -6986,10 +6819,96 @@
         <mc:AlternateContent>
           <mc:Choice Requires="wps">
             <w:drawing>
-              <wp:anchor distT="0" distB="0" distL="114300" distR="114300" simplePos="0" relativeHeight="251702272" behindDoc="0" locked="0" layoutInCell="1" allowOverlap="1" wp14:anchorId="328312B6" wp14:editId="3F04C628">
+              <wp:anchor distT="0" distB="0" distL="114300" distR="114300" simplePos="0" relativeHeight="251700224" behindDoc="0" locked="0" layoutInCell="1" allowOverlap="1" wp14:anchorId="23EFBF8C" wp14:editId="3F65E004">
                 <wp:simplePos x="0" y="0"/>
                 <wp:positionH relativeFrom="column">
-                  <wp:posOffset>764786</wp:posOffset>
+                  <wp:posOffset>695696</wp:posOffset>
+                </wp:positionH>
+                <wp:positionV relativeFrom="paragraph">
+                  <wp:posOffset>157480</wp:posOffset>
+                </wp:positionV>
+                <wp:extent cx="892175" cy="338455"/>
+                <wp:effectExtent l="0" t="0" r="0" b="0"/>
+                <wp:wrapNone/>
+                <wp:docPr id="30" name="Metin Kutusu 30"/>
+                <wp:cNvGraphicFramePr/>
+                <a:graphic xmlns:a="http://schemas.openxmlformats.org/drawingml/2006/main">
+                  <a:graphicData uri="http://schemas.microsoft.com/office/word/2010/wordprocessingShape">
+                    <wps:wsp>
+                      <wps:cNvSpPr txBox="1"/>
+                      <wps:spPr>
+                        <a:xfrm>
+                          <a:off x="0" y="0"/>
+                          <a:ext cx="892175" cy="338455"/>
+                        </a:xfrm>
+                        <a:prstGeom prst="rect">
+                          <a:avLst/>
+                        </a:prstGeom>
+                        <a:noFill/>
+                        <a:ln w="6350">
+                          <a:noFill/>
+                        </a:ln>
+                      </wps:spPr>
+                      <wps:txbx>
+                        <w:txbxContent>
+                          <w:p>
+                            <w:r>
+                              <w:t>Test Set</w:t>
+                            </w:r>
+                          </w:p>
+                        </w:txbxContent>
+                      </wps:txbx>
+                      <wps:bodyPr rot="0" spcFirstLastPara="0" vertOverflow="overflow" horzOverflow="overflow" vert="horz" wrap="square" lIns="91440" tIns="45720" rIns="91440" bIns="45720" numCol="1" spcCol="0" rtlCol="0" fromWordArt="0" anchor="t" anchorCtr="0" forceAA="0" compatLnSpc="1">
+                        <a:prstTxWarp prst="textNoShape">
+                          <a:avLst/>
+                        </a:prstTxWarp>
+                        <a:noAutofit/>
+                      </wps:bodyPr>
+                    </wps:wsp>
+                  </a:graphicData>
+                </a:graphic>
+                <wp14:sizeRelH relativeFrom="margin">
+                  <wp14:pctWidth>0</wp14:pctWidth>
+                </wp14:sizeRelH>
+                <wp14:sizeRelV relativeFrom="margin">
+                  <wp14:pctHeight>0</wp14:pctHeight>
+                </wp14:sizeRelV>
+              </wp:anchor>
+            </w:drawing>
+          </mc:Choice>
+          <mc:Fallback>
+            <w:pict>
+              <v:shapetype w14:anchorId="23EFBF8C" id="_x0000_t202" coordsize="21600,21600" o:spt="202" path="m,l,21600r21600,l21600,xe">
+                <v:stroke joinstyle="miter"/>
+                <v:path gradientshapeok="t" o:connecttype="rect"/>
+              </v:shapetype>
+              <v:shape id="Metin Kutusu 30" o:spid="_x0000_s1027" type="#_x0000_t202" style="position:absolute;left:0;text-align:left;margin-left:54.8pt;margin-top:12.4pt;width:70.25pt;height:26.65pt;z-index:251700224;visibility:visible;mso-wrap-style:square;mso-width-percent:0;mso-height-percent:0;mso-wrap-distance-left:9pt;mso-wrap-distance-top:0;mso-wrap-distance-right:9pt;mso-wrap-distance-bottom:0;mso-position-horizontal:absolute;mso-position-horizontal-relative:text;mso-position-vertical:absolute;mso-position-vertical-relative:text;mso-width-percent:0;mso-height-percent:0;mso-width-relative:margin;mso-height-relative:margin;v-text-anchor:top" o:gfxdata="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" filled="f" stroked="f" strokeweight=".5pt">
+                <v:textbox>
+                  <w:txbxContent>
+                    <w:p>
+                      <w:r>
+                        <w:t>Test Set</w:t>
+                      </w:r>
+                    </w:p>
+                  </w:txbxContent>
+                </v:textbox>
+              </v:shape>
+            </w:pict>
+          </mc:Fallback>
+        </mc:AlternateContent>
+      </w:r>
+      <w:r>
+        <w:rPr>
+          <w:rFonts w:ascii="Times" w:hAnsi="Times"/>
+          <w:noProof/>
+        </w:rPr>
+        <mc:AlternateContent>
+          <mc:Choice Requires="wps">
+            <w:drawing>
+              <wp:anchor distT="0" distB="0" distL="114300" distR="114300" simplePos="0" relativeHeight="251702272" behindDoc="0" locked="0" layoutInCell="1" allowOverlap="1" wp14:anchorId="328312B6" wp14:editId="2F1D1FF2">
+                <wp:simplePos x="0" y="0"/>
+                <wp:positionH relativeFrom="column">
+                  <wp:posOffset>1513576</wp:posOffset>
                 </wp:positionH>
                 <wp:positionV relativeFrom="paragraph">
                   <wp:posOffset>170180</wp:posOffset>
@@ -7011,9 +6930,7 @@
                         <a:prstGeom prst="rect">
                           <a:avLst/>
                         </a:prstGeom>
-                        <a:solidFill>
-                          <a:schemeClr val="lt1"/>
-                        </a:solidFill>
+                        <a:noFill/>
                         <a:ln w="6350">
                           <a:noFill/>
                         </a:ln>
@@ -7047,11 +6964,7 @@
           </mc:Choice>
           <mc:Fallback>
             <w:pict>
-              <v:shapetype w14:anchorId="328312B6" id="_x0000_t202" coordsize="21600,21600" o:spt="202" path="m,l,21600r21600,l21600,xe">
-                <v:stroke joinstyle="miter"/>
-                <v:path gradientshapeok="t" o:connecttype="rect"/>
-              </v:shapetype>
-              <v:shape id="Metin Kutusu 31" o:spid="_x0000_s1027" type="#_x0000_t202" style="position:absolute;left:0;text-align:left;margin-left:60.2pt;margin-top:13.4pt;width:78.35pt;height:26.1pt;z-index:251702272;visibility:visible;mso-wrap-style:square;mso-width-percent:0;mso-height-percent:0;mso-wrap-distance-left:9pt;mso-wrap-distance-top:0;mso-wrap-distance-right:9pt;mso-wrap-distance-bottom:0;mso-position-horizontal:absolute;mso-position-horizontal-relative:text;mso-position-vertical:absolute;mso-position-vertical-relative:text;mso-width-percent:0;mso-height-percent:0;mso-width-relative:margin;mso-height-relative:margin;v-text-anchor:top" o:gfxdata="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" fillcolor="white [3201]" stroked="f" strokeweight=".5pt">
+              <v:shape w14:anchorId="328312B6" id="Metin Kutusu 31" o:spid="_x0000_s1028" type="#_x0000_t202" style="position:absolute;left:0;text-align:left;margin-left:119.2pt;margin-top:13.4pt;width:78.35pt;height:26.1pt;z-index:251702272;visibility:visible;mso-wrap-style:square;mso-width-percent:0;mso-height-percent:0;mso-wrap-distance-left:9pt;mso-wrap-distance-top:0;mso-wrap-distance-right:9pt;mso-wrap-distance-bottom:0;mso-position-horizontal:absolute;mso-position-horizontal-relative:text;mso-position-vertical:absolute;mso-position-vertical-relative:text;mso-width-percent:0;mso-height-percent:0;mso-width-relative:margin;mso-height-relative:margin;v-text-anchor:top" o:gfxdata="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" filled="f" stroked="f" strokeweight=".5pt">
                 <v:textbox>
                   <w:txbxContent>
                     <w:p>
@@ -7066,6 +6979,24 @@
           </mc:Fallback>
         </mc:AlternateContent>
       </w:r>
+    </w:p>
+    <w:p>
+      <w:pPr>
+        <w:spacing w:line="276" w:lineRule="auto"/>
+        <w:jc w:val="both"/>
+        <w:rPr>
+          <w:rFonts w:ascii="Times" w:hAnsi="Times"/>
+        </w:rPr>
+      </w:pPr>
+    </w:p>
+    <w:p>
+      <w:pPr>
+        <w:spacing w:line="276" w:lineRule="auto"/>
+        <w:rPr>
+          <w:rFonts w:ascii="Times" w:hAnsi="Times"/>
+          <w:noProof/>
+        </w:rPr>
+      </w:pPr>
       <w:r>
         <w:rPr>
           <w:rFonts w:ascii="Times" w:hAnsi="Times"/>
@@ -7074,48 +7005,48 @@
         <mc:AlternateContent>
           <mc:Choice Requires="wps">
             <w:drawing>
-              <wp:anchor distT="0" distB="0" distL="114300" distR="114300" simplePos="0" relativeHeight="251700224" behindDoc="0" locked="0" layoutInCell="1" allowOverlap="1" wp14:anchorId="23EFBF8C" wp14:editId="36DD51CD">
+              <wp:anchor distT="0" distB="0" distL="114300" distR="114300" simplePos="0" relativeHeight="251710464" behindDoc="0" locked="0" layoutInCell="1" allowOverlap="1" wp14:anchorId="6E2FCA7D" wp14:editId="7F2CBE69">
                 <wp:simplePos x="0" y="0"/>
                 <wp:positionH relativeFrom="column">
-                  <wp:posOffset>-73066</wp:posOffset>
+                  <wp:posOffset>3543671</wp:posOffset>
                 </wp:positionH>
                 <wp:positionV relativeFrom="paragraph">
-                  <wp:posOffset>157603</wp:posOffset>
+                  <wp:posOffset>191135</wp:posOffset>
                 </wp:positionV>
-                <wp:extent cx="892175" cy="338844"/>
-                <wp:effectExtent l="0" t="0" r="0" b="4445"/>
+                <wp:extent cx="220980" cy="1206500"/>
+                <wp:effectExtent l="0" t="0" r="58420" b="12700"/>
                 <wp:wrapNone/>
-                <wp:docPr id="30" name="Metin Kutusu 30"/>
+                <wp:docPr id="36" name="Sağ Küme Ayracı 36"/>
                 <wp:cNvGraphicFramePr/>
                 <a:graphic xmlns:a="http://schemas.openxmlformats.org/drawingml/2006/main">
                   <a:graphicData uri="http://schemas.microsoft.com/office/word/2010/wordprocessingShape">
                     <wps:wsp>
-                      <wps:cNvSpPr txBox="1"/>
+                      <wps:cNvSpPr/>
                       <wps:spPr>
                         <a:xfrm>
                           <a:off x="0" y="0"/>
-                          <a:ext cx="892175" cy="338844"/>
+                          <a:ext cx="220980" cy="1206500"/>
                         </a:xfrm>
-                        <a:prstGeom prst="rect">
+                        <a:prstGeom prst="rightBrace">
                           <a:avLst/>
                         </a:prstGeom>
-                        <a:solidFill>
-                          <a:schemeClr val="lt1"/>
-                        </a:solidFill>
-                        <a:ln w="6350">
-                          <a:noFill/>
-                        </a:ln>
+                        <a:ln w="12700"/>
                       </wps:spPr>
-                      <wps:txbx>
-                        <w:txbxContent>
-                          <w:p>
-                            <w:r>
-                              <w:t>Test Set</w:t>
-                            </w:r>
-                          </w:p>
-                        </w:txbxContent>
-                      </wps:txbx>
-                      <wps:bodyPr rot="0" spcFirstLastPara="0" vertOverflow="overflow" horzOverflow="overflow" vert="horz" wrap="square" lIns="91440" tIns="45720" rIns="91440" bIns="45720" numCol="1" spcCol="0" rtlCol="0" fromWordArt="0" anchor="t" anchorCtr="0" forceAA="0" compatLnSpc="1">
+                      <wps:style>
+                        <a:lnRef idx="1">
+                          <a:schemeClr val="accent1"/>
+                        </a:lnRef>
+                        <a:fillRef idx="0">
+                          <a:schemeClr val="accent1"/>
+                        </a:fillRef>
+                        <a:effectRef idx="0">
+                          <a:schemeClr val="accent1"/>
+                        </a:effectRef>
+                        <a:fontRef idx="minor">
+                          <a:schemeClr val="tx1"/>
+                        </a:fontRef>
+                      </wps:style>
+                      <wps:bodyPr rot="0" spcFirstLastPara="0" vertOverflow="overflow" horzOverflow="overflow" vert="horz" wrap="square" lIns="91440" tIns="45720" rIns="91440" bIns="45720" numCol="1" spcCol="0" rtlCol="0" fromWordArt="0" anchor="ctr" anchorCtr="0" forceAA="0" compatLnSpc="1">
                         <a:prstTxWarp prst="textNoShape">
                           <a:avLst/>
                         </a:prstTxWarp>
@@ -7135,40 +7066,34 @@
           </mc:Choice>
           <mc:Fallback>
             <w:pict>
-              <v:shape w14:anchorId="23EFBF8C" id="Metin Kutusu 30" o:spid="_x0000_s1028" type="#_x0000_t202" style="position:absolute;left:0;text-align:left;margin-left:-5.75pt;margin-top:12.4pt;width:70.25pt;height:26.7pt;z-index:251700224;visibility:visible;mso-wrap-style:square;mso-width-percent:0;mso-height-percent:0;mso-wrap-distance-left:9pt;mso-wrap-distance-top:0;mso-wrap-distance-right:9pt;mso-wrap-distance-bottom:0;mso-position-horizontal:absolute;mso-position-horizontal-relative:text;mso-position-vertical:absolute;mso-position-vertical-relative:text;mso-width-percent:0;mso-height-percent:0;mso-width-relative:margin;mso-height-relative:margin;v-text-anchor:top" o:gfxdata="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" fillcolor="white [3201]" stroked="f" strokeweight=".5pt">
-                <v:textbox>
-                  <w:txbxContent>
-                    <w:p>
-                      <w:r>
-                        <w:t>Test Set</w:t>
-                      </w:r>
-                    </w:p>
-                  </w:txbxContent>
-                </v:textbox>
+              <v:shapetype w14:anchorId="5DB3F948" id="_x0000_t88" coordsize="21600,21600" o:spt="88" adj="1800,10800" path="m,qx10800@0l10800@2qy21600@11,10800@3l10800@1qy,21600e" filled="f">
+                <v:formulas>
+                  <v:f eqn="val #0"/>
+                  <v:f eqn="sum 21600 0 #0"/>
+                  <v:f eqn="sum #1 0 #0"/>
+                  <v:f eqn="sum #1 #0 0"/>
+                  <v:f eqn="prod #0 9598 32768"/>
+                  <v:f eqn="sum 21600 0 @4"/>
+                  <v:f eqn="sum 21600 0 #1"/>
+                  <v:f eqn="min #1 @6"/>
+                  <v:f eqn="prod @7 1 2"/>
+                  <v:f eqn="prod #0 2 1"/>
+                  <v:f eqn="sum 21600 0 @9"/>
+                  <v:f eqn="val #1"/>
+                </v:formulas>
+                <v:path arrowok="t" o:connecttype="custom" o:connectlocs="0,0;21600,@11;0,21600" textboxrect="0,@4,7637,@5"/>
+                <v:handles>
+                  <v:h position="center,#0" yrange="0,@8"/>
+                  <v:h position="bottomRight,#1" yrange="@9,@10"/>
+                </v:handles>
+              </v:shapetype>
+              <v:shape id="Sağ Küme Ayracı 36" o:spid="_x0000_s1026" type="#_x0000_t88" style="position:absolute;margin-left:279.05pt;margin-top:15.05pt;width:17.4pt;height:95pt;z-index:251710464;visibility:visible;mso-wrap-style:square;mso-width-percent:0;mso-height-percent:0;mso-wrap-distance-left:9pt;mso-wrap-distance-top:0;mso-wrap-distance-right:9pt;mso-wrap-distance-bottom:0;mso-position-horizontal:absolute;mso-position-horizontal-relative:text;mso-position-vertical:absolute;mso-position-vertical-relative:text;mso-width-percent:0;mso-height-percent:0;mso-width-relative:margin;mso-height-relative:margin;v-text-anchor:middle" o:gfxdata="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" adj="330" strokecolor="#4472c4 [3204]" strokeweight="1pt">
+                <v:stroke joinstyle="miter"/>
               </v:shape>
             </w:pict>
           </mc:Fallback>
         </mc:AlternateContent>
       </w:r>
-    </w:p>
-    <w:p>
-      <w:pPr>
-        <w:spacing w:line="276" w:lineRule="auto"/>
-        <w:jc w:val="both"/>
-        <w:rPr>
-          <w:rFonts w:ascii="Times" w:hAnsi="Times"/>
-        </w:rPr>
-      </w:pPr>
-    </w:p>
-    <w:p>
-      <w:pPr>
-        <w:spacing w:line="276" w:lineRule="auto"/>
-        <w:jc w:val="both"/>
-        <w:rPr>
-          <w:rFonts w:ascii="Times" w:hAnsi="Times"/>
-          <w:noProof/>
-        </w:rPr>
-      </w:pPr>
       <w:r>
         <w:rPr>
           <w:rFonts w:ascii="Times" w:hAnsi="Times"/>
@@ -7177,15 +7102,15 @@
         <mc:AlternateContent>
           <mc:Choice Requires="wps">
             <w:drawing>
-              <wp:anchor distT="0" distB="0" distL="114300" distR="114300" simplePos="0" relativeHeight="251712512" behindDoc="0" locked="0" layoutInCell="1" allowOverlap="1" wp14:anchorId="7DB4BB2B" wp14:editId="6773D75A">
+              <wp:anchor distT="0" distB="0" distL="114300" distR="114300" simplePos="0" relativeHeight="251712512" behindDoc="0" locked="0" layoutInCell="1" allowOverlap="1" wp14:anchorId="7DB4BB2B" wp14:editId="49B34206">
                 <wp:simplePos x="0" y="0"/>
                 <wp:positionH relativeFrom="column">
-                  <wp:posOffset>3000887</wp:posOffset>
+                  <wp:posOffset>3824928</wp:posOffset>
                 </wp:positionH>
                 <wp:positionV relativeFrom="paragraph">
-                  <wp:posOffset>530860</wp:posOffset>
+                  <wp:posOffset>478790</wp:posOffset>
                 </wp:positionV>
-                <wp:extent cx="1371600" cy="715296"/>
+                <wp:extent cx="1371600" cy="715010"/>
                 <wp:effectExtent l="0" t="0" r="0" b="0"/>
                 <wp:wrapNone/>
                 <wp:docPr id="37" name="Metin Kutusu 37"/>
@@ -7197,7 +7122,7 @@
                       <wps:spPr>
                         <a:xfrm>
                           <a:off x="0" y="0"/>
-                          <a:ext cx="1371600" cy="715296"/>
+                          <a:ext cx="1371600" cy="715010"/>
                         </a:xfrm>
                         <a:prstGeom prst="rect">
                           <a:avLst/>
@@ -7321,7 +7246,7 @@
           </mc:Choice>
           <mc:Fallback>
             <w:pict>
-              <v:shape w14:anchorId="7DB4BB2B" id="Metin Kutusu 37" o:spid="_x0000_s1029" type="#_x0000_t202" style="position:absolute;left:0;text-align:left;margin-left:236.3pt;margin-top:41.8pt;width:108pt;height:56.3pt;z-index:251712512;visibility:visible;mso-wrap-style:square;mso-width-percent:0;mso-height-percent:0;mso-wrap-distance-left:9pt;mso-wrap-distance-top:0;mso-wrap-distance-right:9pt;mso-wrap-distance-bottom:0;mso-position-horizontal:absolute;mso-position-horizontal-relative:text;mso-position-vertical:absolute;mso-position-vertical-relative:text;mso-width-percent:0;mso-height-percent:0;mso-width-relative:margin;mso-height-relative:margin;v-text-anchor:top" o:gfxdata="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" fillcolor="white [3201]" stroked="f" strokeweight=".5pt">
+              <v:shape w14:anchorId="7DB4BB2B" id="Metin Kutusu 37" o:spid="_x0000_s1029" type="#_x0000_t202" style="position:absolute;margin-left:301.2pt;margin-top:37.7pt;width:108pt;height:56.3pt;z-index:251712512;visibility:visible;mso-wrap-style:square;mso-width-percent:0;mso-height-percent:0;mso-wrap-distance-left:9pt;mso-wrap-distance-top:0;mso-wrap-distance-right:9pt;mso-wrap-distance-bottom:0;mso-position-horizontal:absolute;mso-position-horizontal-relative:text;mso-position-vertical:absolute;mso-position-vertical-relative:text;mso-width-percent:0;mso-height-percent:0;mso-width-relative:margin;mso-height-relative:margin;v-text-anchor:top" o:gfxdata="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" fillcolor="white [3201]" stroked="f" strokeweight=".5pt">
                 <v:textbox>
                   <w:txbxContent>
                     <w:p>
@@ -7424,97 +7349,7 @@
           <w:rFonts w:ascii="Times" w:hAnsi="Times"/>
           <w:noProof/>
         </w:rPr>
-        <mc:AlternateContent>
-          <mc:Choice Requires="wps">
-            <w:drawing>
-              <wp:anchor distT="0" distB="0" distL="114300" distR="114300" simplePos="0" relativeHeight="251710464" behindDoc="0" locked="0" layoutInCell="1" allowOverlap="1" wp14:anchorId="6E2FCA7D" wp14:editId="325FA9E4">
-                <wp:simplePos x="0" y="0"/>
-                <wp:positionH relativeFrom="column">
-                  <wp:posOffset>2743057</wp:posOffset>
-                </wp:positionH>
-                <wp:positionV relativeFrom="paragraph">
-                  <wp:posOffset>141646</wp:posOffset>
-                </wp:positionV>
-                <wp:extent cx="221225" cy="1402326"/>
-                <wp:effectExtent l="0" t="0" r="45720" b="7620"/>
-                <wp:wrapNone/>
-                <wp:docPr id="36" name="Sağ Küme Ayracı 36"/>
-                <wp:cNvGraphicFramePr/>
-                <a:graphic xmlns:a="http://schemas.openxmlformats.org/drawingml/2006/main">
-                  <a:graphicData uri="http://schemas.microsoft.com/office/word/2010/wordprocessingShape">
-                    <wps:wsp>
-                      <wps:cNvSpPr/>
-                      <wps:spPr>
-                        <a:xfrm>
-                          <a:off x="0" y="0"/>
-                          <a:ext cx="221225" cy="1402326"/>
-                        </a:xfrm>
-                        <a:prstGeom prst="rightBrace">
-                          <a:avLst/>
-                        </a:prstGeom>
-                        <a:ln w="12700"/>
-                      </wps:spPr>
-                      <wps:style>
-                        <a:lnRef idx="1">
-                          <a:schemeClr val="accent1"/>
-                        </a:lnRef>
-                        <a:fillRef idx="0">
-                          <a:schemeClr val="accent1"/>
-                        </a:fillRef>
-                        <a:effectRef idx="0">
-                          <a:schemeClr val="accent1"/>
-                        </a:effectRef>
-                        <a:fontRef idx="minor">
-                          <a:schemeClr val="tx1"/>
-                        </a:fontRef>
-                      </wps:style>
-                      <wps:bodyPr rot="0" spcFirstLastPara="0" vertOverflow="overflow" horzOverflow="overflow" vert="horz" wrap="square" lIns="91440" tIns="45720" rIns="91440" bIns="45720" numCol="1" spcCol="0" rtlCol="0" fromWordArt="0" anchor="ctr" anchorCtr="0" forceAA="0" compatLnSpc="1">
-                        <a:prstTxWarp prst="textNoShape">
-                          <a:avLst/>
-                        </a:prstTxWarp>
-                        <a:noAutofit/>
-                      </wps:bodyPr>
-                    </wps:wsp>
-                  </a:graphicData>
-                </a:graphic>
-                <wp14:sizeRelH relativeFrom="margin">
-                  <wp14:pctWidth>0</wp14:pctWidth>
-                </wp14:sizeRelH>
-                <wp14:sizeRelV relativeFrom="margin">
-                  <wp14:pctHeight>0</wp14:pctHeight>
-                </wp14:sizeRelV>
-              </wp:anchor>
-            </w:drawing>
-          </mc:Choice>
-          <mc:Fallback>
-            <w:pict>
-              <v:shapetype w14:anchorId="788810C5" id="_x0000_t88" coordsize="21600,21600" o:spt="88" adj="1800,10800" path="m,qx10800@0l10800@2qy21600@11,10800@3l10800@1qy,21600e" filled="f">
-                <v:formulas>
-                  <v:f eqn="val #0"/>
-                  <v:f eqn="sum 21600 0 #0"/>
-                  <v:f eqn="sum #1 0 #0"/>
-                  <v:f eqn="sum #1 #0 0"/>
-                  <v:f eqn="prod #0 9598 32768"/>
-                  <v:f eqn="sum 21600 0 @4"/>
-                  <v:f eqn="sum 21600 0 #1"/>
-                  <v:f eqn="min #1 @6"/>
-                  <v:f eqn="prod @7 1 2"/>
-                  <v:f eqn="prod #0 2 1"/>
-                  <v:f eqn="sum 21600 0 @9"/>
-                  <v:f eqn="val #1"/>
-                </v:formulas>
-                <v:path arrowok="t" o:connecttype="custom" o:connectlocs="0,0;21600,@11;0,21600" textboxrect="0,@4,7637,@5"/>
-                <v:handles>
-                  <v:h position="center,#0" yrange="0,@8"/>
-                  <v:h position="bottomRight,#1" yrange="@9,@10"/>
-                </v:handles>
-              </v:shapetype>
-              <v:shape id="Sağ Küme Ayracı 36" o:spid="_x0000_s1026" type="#_x0000_t88" style="position:absolute;margin-left:3in;margin-top:11.15pt;width:17.4pt;height:110.4pt;z-index:251710464;visibility:visible;mso-wrap-style:square;mso-width-percent:0;mso-height-percent:0;mso-wrap-distance-left:9pt;mso-wrap-distance-top:0;mso-wrap-distance-right:9pt;mso-wrap-distance-bottom:0;mso-position-horizontal:absolute;mso-position-horizontal-relative:text;mso-position-vertical:absolute;mso-position-vertical-relative:text;mso-width-percent:0;mso-height-percent:0;mso-width-relative:margin;mso-height-relative:margin;v-text-anchor:middle" o:gfxdata="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" adj="284" strokecolor="#4472c4 [3204]" strokeweight="1pt">
-                <v:stroke joinstyle="miter"/>
-              </v:shape>
-            </w:pict>
-          </mc:Fallback>
-        </mc:AlternateContent>
+        <w:t xml:space="preserve">                       </w:t>
       </w:r>
       <w:r>
         <w:rPr>
@@ -7522,9 +7357,9 @@
           <w:noProof/>
         </w:rPr>
         <w:drawing>
-          <wp:inline distT="0" distB="0" distL="0" distR="0" wp14:anchorId="2A56FA91" wp14:editId="4AF13C6C">
-            <wp:extent cx="2728451" cy="1608896"/>
-            <wp:effectExtent l="0" t="0" r="0" b="6350"/>
+          <wp:inline distT="0" distB="0" distL="0" distR="0" wp14:anchorId="2A56FA91" wp14:editId="02D864D8">
+            <wp:extent cx="2727325" cy="1397480"/>
+            <wp:effectExtent l="0" t="0" r="3175" b="0"/>
             <wp:docPr id="106" name="Resim 106"/>
             <wp:cNvGraphicFramePr>
               <a:graphicFrameLocks xmlns:a="http://schemas.openxmlformats.org/drawingml/2006/main" noChangeAspect="1"/>
@@ -7551,7 +7386,7 @@
                   <pic:spPr>
                     <a:xfrm>
                       <a:off x="0" y="0"/>
-                      <a:ext cx="2728451" cy="1608896"/>
+                      <a:ext cx="2748306" cy="1408231"/>
                     </a:xfrm>
                     <a:prstGeom prst="rect">
                       <a:avLst/>
@@ -7593,15 +7428,6 @@
     <w:p>
       <w:pPr>
         <w:spacing w:line="276" w:lineRule="auto"/>
-        <w:rPr>
-          <w:rFonts w:ascii="Times" w:hAnsi="Times"/>
-        </w:rPr>
-      </w:pPr>
-    </w:p>
-    <w:p>
-      <w:pPr>
-        <w:spacing w:line="276" w:lineRule="auto"/>
-        <w:jc w:val="center"/>
         <w:rPr>
           <w:rFonts w:ascii="Times" w:hAnsi="Times"/>
         </w:rPr>
@@ -7658,6 +7484,9 @@
         <w:spacing w:line="276" w:lineRule="auto"/>
         <w:ind w:firstLine="360"/>
         <w:jc w:val="both"/>
+        <w:rPr>
+          <w:rFonts w:ascii="Times" w:hAnsi="Times"/>
+        </w:rPr>
       </w:pPr>
       <w:r>
         <w:rPr>
@@ -8531,13 +8360,7 @@
         <w:rPr>
           <w:rFonts w:ascii="Times" w:hAnsi="Times"/>
         </w:rPr>
-        <w:t xml:space="preserve"> </w:t>
-      </w:r>
-      <w:r>
-        <w:rPr>
-          <w:rFonts w:ascii="Times" w:hAnsi="Times"/>
-        </w:rPr>
-        <w:t>(</w:t>
+        <w:t xml:space="preserve"> (</w:t>
       </w:r>
       <w:r>
         <w:t xml:space="preserve">Colors for </w:t>
@@ -8830,13 +8653,7 @@
         <w:rPr>
           <w:rFonts w:ascii="Times" w:hAnsi="Times"/>
         </w:rPr>
-        <w:t xml:space="preserve"> </w:t>
-      </w:r>
-      <w:r>
-        <w:rPr>
-          <w:rFonts w:ascii="Times" w:hAnsi="Times"/>
-        </w:rPr>
-        <w:t>(</w:t>
+        <w:t xml:space="preserve"> (</w:t>
       </w:r>
       <w:r>
         <w:t xml:space="preserve">Colors for </w:t>
@@ -8869,13 +8686,7 @@
         <w:rPr>
           <w:rFonts w:ascii="Times" w:hAnsi="Times"/>
         </w:rPr>
-        <w:t>)</w:t>
-      </w:r>
-      <w:r>
-        <w:rPr>
-          <w:rFonts w:ascii="Times" w:hAnsi="Times"/>
-        </w:rPr>
-        <w:t xml:space="preserve"> </w:t>
+        <w:t xml:space="preserve">) </w:t>
       </w:r>
     </w:p>
     <w:p>
@@ -9127,13 +8938,7 @@
         <w:rPr>
           <w:rFonts w:ascii="Times" w:hAnsi="Times"/>
         </w:rPr>
-        <w:t xml:space="preserve"> </w:t>
-      </w:r>
-      <w:r>
-        <w:rPr>
-          <w:rFonts w:ascii="Times" w:hAnsi="Times"/>
-        </w:rPr>
-        <w:t>(</w:t>
+        <w:t xml:space="preserve"> (</w:t>
       </w:r>
       <w:r>
         <w:t xml:space="preserve">Colors for </w:t>
@@ -9417,13 +9222,7 @@
         <w:rPr>
           <w:rFonts w:ascii="Times" w:hAnsi="Times"/>
         </w:rPr>
-        <w:t xml:space="preserve"> </w:t>
-      </w:r>
-      <w:r>
-        <w:rPr>
-          <w:rFonts w:ascii="Times" w:hAnsi="Times"/>
-        </w:rPr>
-        <w:t>(</w:t>
+        <w:t xml:space="preserve"> (</w:t>
       </w:r>
       <w:r>
         <w:t xml:space="preserve">Colors for </w:t>
@@ -9458,15 +9257,6 @@
         </w:rPr>
         <w:t>)</w:t>
       </w:r>
-    </w:p>
-    <w:p>
-      <w:pPr>
-        <w:spacing w:line="276" w:lineRule="auto"/>
-        <w:jc w:val="both"/>
-        <w:rPr>
-          <w:rFonts w:ascii="Times" w:hAnsi="Times"/>
-        </w:rPr>
-      </w:pPr>
     </w:p>
     <w:p>
       <w:pPr>
@@ -9529,7 +9319,7 @@
           <w:p>
             <w:pPr>
               <w:spacing w:line="276" w:lineRule="auto"/>
-              <w:jc w:val="both"/>
+              <w:jc w:val="center"/>
               <w:rPr>
                 <w:rFonts w:ascii="Times" w:hAnsi="Times"/>
               </w:rPr>
@@ -9555,13 +9345,7 @@
               <w:rPr>
                 <w:rFonts w:ascii="Times" w:hAnsi="Times"/>
               </w:rPr>
-              <w:t>CNN</w:t>
-            </w:r>
-            <w:r>
-              <w:rPr>
-                <w:rFonts w:ascii="Times" w:hAnsi="Times"/>
-              </w:rPr>
-              <w:t xml:space="preserve"> </w:t>
+              <w:t>Test Accuracy (%)</w:t>
             </w:r>
           </w:p>
         </w:tc>
@@ -9579,7 +9363,7 @@
           <w:p>
             <w:pPr>
               <w:spacing w:line="276" w:lineRule="auto"/>
-              <w:jc w:val="both"/>
+              <w:jc w:val="center"/>
               <w:rPr>
                 <w:rFonts w:ascii="Times" w:hAnsi="Times"/>
               </w:rPr>
@@ -9588,7 +9372,7 @@
               <w:rPr>
                 <w:rFonts w:ascii="Times" w:hAnsi="Times"/>
               </w:rPr>
-              <w:t>Test Accuracy (%)</w:t>
+              <w:t>CNN  Model</w:t>
             </w:r>
           </w:p>
         </w:tc>
@@ -10224,7 +10008,6 @@
     <w:p>
       <w:pPr>
         <w:spacing w:line="276" w:lineRule="auto"/>
-        <w:jc w:val="both"/>
         <w:rPr>
           <w:rFonts w:ascii="Times" w:hAnsi="Times"/>
         </w:rPr>
@@ -10682,7 +10465,15 @@
                 <w:sz w:val="20"/>
                 <w:szCs w:val="20"/>
               </w:rPr>
-              <w:t>62.43</w:t>
+              <w:t>62.</w:t>
+            </w:r>
+            <w:r>
+              <w:rPr>
+                <w:rFonts w:ascii="Times" w:hAnsi="Times"/>
+                <w:sz w:val="20"/>
+                <w:szCs w:val="20"/>
+              </w:rPr>
+              <w:t>26</w:t>
             </w:r>
           </w:p>
         </w:tc>
@@ -10707,7 +10498,15 @@
                 <w:sz w:val="20"/>
                 <w:szCs w:val="20"/>
               </w:rPr>
-              <w:t>63.76</w:t>
+              <w:t>63.</w:t>
+            </w:r>
+            <w:r>
+              <w:rPr>
+                <w:rFonts w:ascii="Times" w:hAnsi="Times"/>
+                <w:sz w:val="20"/>
+                <w:szCs w:val="20"/>
+              </w:rPr>
+              <w:t>67</w:t>
             </w:r>
           </w:p>
         </w:tc>
@@ -10732,7 +10531,15 @@
                 <w:sz w:val="20"/>
                 <w:szCs w:val="20"/>
               </w:rPr>
-              <w:t>61.49</w:t>
+              <w:t>61.</w:t>
+            </w:r>
+            <w:r>
+              <w:rPr>
+                <w:rFonts w:ascii="Times" w:hAnsi="Times"/>
+                <w:sz w:val="20"/>
+                <w:szCs w:val="20"/>
+              </w:rPr>
+              <w:t>28</w:t>
             </w:r>
           </w:p>
         </w:tc>
@@ -10817,7 +10624,15 @@
                 <w:sz w:val="20"/>
                 <w:szCs w:val="20"/>
               </w:rPr>
-              <w:t>63.44</w:t>
+              <w:t>63.</w:t>
+            </w:r>
+            <w:r>
+              <w:rPr>
+                <w:rFonts w:ascii="Times" w:hAnsi="Times"/>
+                <w:sz w:val="20"/>
+                <w:szCs w:val="20"/>
+              </w:rPr>
+              <w:t>94</w:t>
             </w:r>
           </w:p>
         </w:tc>
@@ -10842,7 +10657,15 @@
                 <w:sz w:val="20"/>
                 <w:szCs w:val="20"/>
               </w:rPr>
-              <w:t>62.62</w:t>
+              <w:t>6</w:t>
+            </w:r>
+            <w:r>
+              <w:rPr>
+                <w:rFonts w:ascii="Times" w:hAnsi="Times"/>
+                <w:sz w:val="20"/>
+                <w:szCs w:val="20"/>
+              </w:rPr>
+              <w:t>3.23</w:t>
             </w:r>
           </w:p>
         </w:tc>
@@ -10867,7 +10690,15 @@
                 <w:sz w:val="20"/>
                 <w:szCs w:val="20"/>
               </w:rPr>
-              <w:t>64.23</w:t>
+              <w:t>64.</w:t>
+            </w:r>
+            <w:r>
+              <w:rPr>
+                <w:rFonts w:ascii="Times" w:hAnsi="Times"/>
+                <w:sz w:val="20"/>
+                <w:szCs w:val="20"/>
+              </w:rPr>
+              <w:t>63</w:t>
             </w:r>
           </w:p>
         </w:tc>
@@ -10949,7 +10780,15 @@
                 <w:sz w:val="20"/>
                 <w:szCs w:val="20"/>
               </w:rPr>
-              <w:t>57.64</w:t>
+              <w:t>57.</w:t>
+            </w:r>
+            <w:r>
+              <w:rPr>
+                <w:rFonts w:ascii="Times" w:hAnsi="Times"/>
+                <w:sz w:val="20"/>
+                <w:szCs w:val="20"/>
+              </w:rPr>
+              <w:t>22</w:t>
             </w:r>
           </w:p>
         </w:tc>
@@ -10977,7 +10816,15 @@
                 <w:sz w:val="20"/>
                 <w:szCs w:val="20"/>
               </w:rPr>
-              <w:t>54.77</w:t>
+              <w:t>54.</w:t>
+            </w:r>
+            <w:r>
+              <w:rPr>
+                <w:rFonts w:ascii="Times" w:hAnsi="Times"/>
+                <w:sz w:val="20"/>
+                <w:szCs w:val="20"/>
+              </w:rPr>
+              <w:t>51</w:t>
             </w:r>
           </w:p>
         </w:tc>
@@ -11005,7 +10852,15 @@
                 <w:sz w:val="20"/>
                 <w:szCs w:val="20"/>
               </w:rPr>
-              <w:t>64.18</w:t>
+              <w:t>6</w:t>
+            </w:r>
+            <w:r>
+              <w:rPr>
+                <w:rFonts w:ascii="Times" w:hAnsi="Times"/>
+                <w:sz w:val="20"/>
+                <w:szCs w:val="20"/>
+              </w:rPr>
+              <w:t>3.24</w:t>
             </w:r>
           </w:p>
         </w:tc>
@@ -11892,6 +11747,7 @@
         <w:jc w:val="both"/>
         <w:rPr>
           <w:rStyle w:val="jlqj4b"/>
+          <w:u w:val="single"/>
         </w:rPr>
       </w:pPr>
       <w:r>
@@ -12032,6 +11888,7 @@
         <w:jc w:val="both"/>
         <w:rPr>
           <w:rStyle w:val="jlqj4b"/>
+          <w:u w:val="single"/>
         </w:rPr>
       </w:pPr>
     </w:p>
@@ -12042,6 +11899,7 @@
         <w:jc w:val="both"/>
         <w:rPr>
           <w:rStyle w:val="jlqj4b"/>
+          <w:u w:val="single"/>
         </w:rPr>
       </w:pPr>
     </w:p>
@@ -12052,6 +11910,7 @@
         <w:jc w:val="both"/>
         <w:rPr>
           <w:rStyle w:val="jlqj4b"/>
+          <w:u w:val="single"/>
         </w:rPr>
       </w:pPr>
     </w:p>
@@ -12062,6 +11921,7 @@
         <w:jc w:val="both"/>
         <w:rPr>
           <w:rStyle w:val="jlqj4b"/>
+          <w:u w:val="single"/>
         </w:rPr>
       </w:pPr>
     </w:p>
@@ -12072,6 +11932,7 @@
         <w:jc w:val="both"/>
         <w:rPr>
           <w:rStyle w:val="jlqj4b"/>
+          <w:u w:val="single"/>
         </w:rPr>
       </w:pPr>
     </w:p>
@@ -12082,6 +11943,7 @@
         <w:jc w:val="both"/>
         <w:rPr>
           <w:rStyle w:val="jlqj4b"/>
+          <w:u w:val="single"/>
         </w:rPr>
       </w:pPr>
     </w:p>
@@ -12092,6 +11954,7 @@
         <w:jc w:val="both"/>
         <w:rPr>
           <w:rStyle w:val="jlqj4b"/>
+          <w:u w:val="single"/>
         </w:rPr>
       </w:pPr>
     </w:p>
@@ -12102,6 +11965,7 @@
         <w:jc w:val="both"/>
         <w:rPr>
           <w:rStyle w:val="jlqj4b"/>
+          <w:u w:val="single"/>
         </w:rPr>
       </w:pPr>
     </w:p>
@@ -12112,6 +11976,7 @@
         <w:jc w:val="both"/>
         <w:rPr>
           <w:rStyle w:val="jlqj4b"/>
+          <w:u w:val="single"/>
         </w:rPr>
       </w:pPr>
     </w:p>
@@ -12679,7 +12544,13 @@
           <w:b/>
           <w:bCs/>
         </w:rPr>
-        <w:t>:</w:t>
+        <w:t xml:space="preserve">: a) </w:t>
+      </w:r>
+      <w:r>
+        <w:rPr>
+          <w:rFonts w:ascii="Times" w:hAnsi="Times"/>
+        </w:rPr>
+        <w:t xml:space="preserve">The form of confusion matrix, and the computation of Sensitivity, Accuracy and Specificity. </w:t>
       </w:r>
       <w:r>
         <w:rPr>
@@ -12687,29 +12558,7 @@
           <w:b/>
           <w:bCs/>
         </w:rPr>
-        <w:t xml:space="preserve"> a) </w:t>
-      </w:r>
-      <w:r>
-        <w:rPr>
-          <w:rFonts w:ascii="Times" w:hAnsi="Times"/>
-        </w:rPr>
-        <w:t xml:space="preserve">The form of confusion matrix, and the computation of Sensitivity, Accuracy and Specificity. </w:t>
-      </w:r>
-      <w:r>
-        <w:rPr>
-          <w:rFonts w:ascii="Times" w:hAnsi="Times"/>
-          <w:b/>
-          <w:bCs/>
-        </w:rPr>
-        <w:t>b)</w:t>
-      </w:r>
-      <w:r>
-        <w:rPr>
-          <w:rFonts w:ascii="Times" w:hAnsi="Times"/>
-          <w:b/>
-          <w:bCs/>
-        </w:rPr>
-        <w:t xml:space="preserve"> </w:t>
+        <w:t xml:space="preserve">b) </w:t>
       </w:r>
       <w:r>
         <w:rPr>
@@ -13128,72 +12977,76 @@
     <w:p>
       <w:pPr>
         <w:spacing w:line="276" w:lineRule="auto"/>
+        <w:ind w:firstLine="708"/>
         <w:jc w:val="both"/>
         <w:rPr>
           <w:rStyle w:val="jlqj4b"/>
         </w:rPr>
       </w:pPr>
+      <w:r>
+        <w:rPr>
+          <w:rStyle w:val="jlqj4b"/>
+        </w:rPr>
+        <w:t>Hereby, i</w:t>
+      </w:r>
+      <w:r>
+        <w:rPr>
+          <w:rStyle w:val="jlqj4b"/>
+        </w:rPr>
+        <w:t>t is considered that the results obtained are better than other results in the literature</w:t>
+      </w:r>
+      <w:r>
+        <w:rPr>
+          <w:rStyle w:val="jlqj4b"/>
+        </w:rPr>
+        <w:t xml:space="preserve"> and </w:t>
+      </w:r>
+      <w:r>
+        <w:rPr>
+          <w:rStyle w:val="jlqj4b"/>
+        </w:rPr>
+        <w:t>a</w:t>
+      </w:r>
+      <w:r>
+        <w:rPr>
+          <w:rStyle w:val="jlqj4b"/>
+        </w:rPr>
+        <w:t xml:space="preserve"> significant contribution is made to the literature for the diagnosis of Autism disease with the proposed structures.</w:t>
+      </w:r>
+      <w:r>
+        <w:rPr>
+          <w:rStyle w:val="jlqj4b"/>
+        </w:rPr>
+        <w:t xml:space="preserve"> </w:t>
+      </w:r>
+      <w:r>
+        <w:rPr>
+          <w:rStyle w:val="jlqj4b"/>
+        </w:rPr>
+        <w:t>In future studies, the same brain MRI can be used to diagnose neural diseases such as schizophrenia, autism, and Alzheimer's.</w:t>
+      </w:r>
+      <w:r>
+        <w:rPr>
+          <w:rStyle w:val="viiyi"/>
+        </w:rPr>
+        <w:t xml:space="preserve"> </w:t>
+      </w:r>
+      <w:r>
+        <w:rPr>
+          <w:rStyle w:val="jlqj4b"/>
+        </w:rPr>
+        <w:t>This may be pave the way for the study to be conducted on animals as well.</w:t>
+      </w:r>
     </w:p>
     <w:p>
       <w:pPr>
         <w:spacing w:line="276" w:lineRule="auto"/>
         <w:ind w:firstLine="708"/>
         <w:jc w:val="both"/>
+        <w:rPr>
+          <w:rStyle w:val="jlqj4b"/>
+        </w:rPr>
       </w:pPr>
-      <w:r>
-        <w:rPr>
-          <w:rStyle w:val="jlqj4b"/>
-        </w:rPr>
-        <w:t>Hereby, i</w:t>
-      </w:r>
-      <w:r>
-        <w:rPr>
-          <w:rStyle w:val="jlqj4b"/>
-        </w:rPr>
-        <w:t>t is considered that the results obtained are better than other results in the literature</w:t>
-      </w:r>
-      <w:r>
-        <w:rPr>
-          <w:rStyle w:val="jlqj4b"/>
-        </w:rPr>
-        <w:t xml:space="preserve"> and </w:t>
-      </w:r>
-      <w:r>
-        <w:rPr>
-          <w:rStyle w:val="jlqj4b"/>
-        </w:rPr>
-        <w:t>a</w:t>
-      </w:r>
-      <w:r>
-        <w:rPr>
-          <w:rStyle w:val="jlqj4b"/>
-        </w:rPr>
-        <w:t xml:space="preserve"> significant contribution is made to the literature for the diagnosis of Autism disease with the proposed structures.</w:t>
-      </w:r>
-      <w:r>
-        <w:rPr>
-          <w:rStyle w:val="jlqj4b"/>
-        </w:rPr>
-        <w:t xml:space="preserve"> </w:t>
-      </w:r>
-      <w:r>
-        <w:rPr>
-          <w:rStyle w:val="jlqj4b"/>
-        </w:rPr>
-        <w:t>In future studies, the same brain MRI can be used to diagnose neural diseases such as schizophrenia, autism, and Alzheimer's.</w:t>
-      </w:r>
-      <w:r>
-        <w:rPr>
-          <w:rStyle w:val="viiyi"/>
-        </w:rPr>
-        <w:t xml:space="preserve"> </w:t>
-      </w:r>
-      <w:r>
-        <w:rPr>
-          <w:rStyle w:val="jlqj4b"/>
-        </w:rPr>
-        <w:t>This may be pave the way for the study to be conducted on animals as well.</w:t>
-      </w:r>
     </w:p>
     <w:p>
       <w:pPr>
@@ -14210,6 +14063,11 @@
         <w:docPartUnique/>
       </w:docPartObj>
     </w:sdtPr>
+    <w:sdtEndPr>
+      <w:rPr>
+        <w:rStyle w:val="PageNumber"/>
+      </w:rPr>
+    </w:sdtEndPr>
     <w:sdtContent>
       <w:p>
         <w:pPr>
@@ -14262,6 +14120,11 @@
         <w:docPartUnique/>
       </w:docPartObj>
     </w:sdtPr>
+    <w:sdtEndPr>
+      <w:rPr>
+        <w:rStyle w:val="PageNumber"/>
+      </w:rPr>
+    </w:sdtEndPr>
     <w:sdtContent>
       <w:p>
         <w:pPr>
@@ -15478,6 +15341,14 @@
       <w:szCs w:val="18"/>
       <w:lang w:val="en-US" w:eastAsia="tr-TR"/>
     </w:rPr>
+  </w:style>
+  <w:style w:type="paragraph" w:styleId="NormalWeb">
+    <w:name w:val="Normal (Web)"/>
+    <w:basedOn w:val="Normal"/>
+    <w:uiPriority w:val="99"/>
+    <w:semiHidden/>
+    <w:unhideWhenUsed/>
+    <w:rsid w:val="00907F6B"/>
   </w:style>
 </w:styles>
 </file>

</xml_diff>